<commit_message>
Modificacion de la documentacion del proyecto
</commit_message>
<xml_diff>
--- a/docs/ProyectoFinalSOftware.docx
+++ b/docs/ProyectoFinalSOftware.docx
@@ -808,7 +808,12 @@
               <w:tab w:val="right" w:leader="dot" w:pos="8494"/>
             </w:tabs>
             <w:rPr>
+              <w:rFonts w:asciiTheme="minorHAnsi" w:eastAsiaTheme="minorEastAsia" w:hAnsiTheme="minorHAnsi" w:cstheme="minorBidi"/>
               <w:noProof/>
+              <w:kern w:val="2"/>
+              <w:sz w:val="24"/>
+              <w:szCs w:val="24"/>
+              <w14:ligatures w14:val="standardContextual"/>
             </w:rPr>
           </w:pPr>
           <w:r>
@@ -820,7 +825,7 @@
           <w:r>
             <w:fldChar w:fldCharType="separate"/>
           </w:r>
-          <w:hyperlink w:anchor="_Toc239067881" w:history="1">
+          <w:hyperlink w:anchor="_Toc239278344" w:history="1">
             <w:r>
               <w:rPr>
                 <w:rStyle w:val="Hipervnculo"/>
@@ -828,7 +833,7 @@
                 <w:bCs/>
                 <w:noProof/>
               </w:rPr>
-              <w:t>1. Planteamiento de la problemática</w:t>
+              <w:t>1. Perfil del proyecto</w:t>
             </w:r>
             <w:r>
               <w:rPr>
@@ -849,7 +854,7 @@
                 <w:noProof/>
                 <w:webHidden/>
               </w:rPr>
-              <w:instrText xml:space="preserve"> PAGEREF _Toc239067881 \h </w:instrText>
+              <w:instrText xml:space="preserve"> PAGEREF _Toc239278344 \h </w:instrText>
             </w:r>
             <w:r>
               <w:rPr>
@@ -869,7 +874,383 @@
                 <w:noProof/>
                 <w:webHidden/>
               </w:rPr>
-              <w:t>3</w:t>
+              <w:t>4</w:t>
+            </w:r>
+            <w:r>
+              <w:rPr>
+                <w:noProof/>
+                <w:webHidden/>
+              </w:rPr>
+              <w:fldChar w:fldCharType="end"/>
+            </w:r>
+          </w:hyperlink>
+        </w:p>
+        <w:p>
+          <w:pPr>
+            <w:pStyle w:val="TDC2"/>
+            <w:tabs>
+              <w:tab w:val="right" w:leader="dot" w:pos="8494"/>
+            </w:tabs>
+            <w:rPr>
+              <w:rFonts w:asciiTheme="minorHAnsi" w:eastAsiaTheme="minorEastAsia" w:hAnsiTheme="minorHAnsi" w:cstheme="minorBidi"/>
+              <w:noProof/>
+              <w:kern w:val="2"/>
+              <w:sz w:val="24"/>
+              <w:szCs w:val="24"/>
+              <w14:ligatures w14:val="standardContextual"/>
+            </w:rPr>
+          </w:pPr>
+          <w:hyperlink w:anchor="_Toc239278345" w:history="1">
+            <w:r>
+              <w:rPr>
+                <w:rStyle w:val="Hipervnculo"/>
+                <w:b/>
+                <w:bCs/>
+                <w:noProof/>
+              </w:rPr>
+              <w:t>1.1. Planteamiento de la problemática</w:t>
+            </w:r>
+            <w:r>
+              <w:rPr>
+                <w:noProof/>
+                <w:webHidden/>
+              </w:rPr>
+              <w:tab/>
+            </w:r>
+            <w:r>
+              <w:rPr>
+                <w:noProof/>
+                <w:webHidden/>
+              </w:rPr>
+              <w:fldChar w:fldCharType="begin"/>
+            </w:r>
+            <w:r>
+              <w:rPr>
+                <w:noProof/>
+                <w:webHidden/>
+              </w:rPr>
+              <w:instrText xml:space="preserve"> PAGEREF _Toc239278345 \h </w:instrText>
+            </w:r>
+            <w:r>
+              <w:rPr>
+                <w:noProof/>
+                <w:webHidden/>
+              </w:rPr>
+            </w:r>
+            <w:r>
+              <w:rPr>
+                <w:noProof/>
+                <w:webHidden/>
+              </w:rPr>
+              <w:fldChar w:fldCharType="separate"/>
+            </w:r>
+            <w:r>
+              <w:rPr>
+                <w:noProof/>
+                <w:webHidden/>
+              </w:rPr>
+              <w:t>4</w:t>
+            </w:r>
+            <w:r>
+              <w:rPr>
+                <w:noProof/>
+                <w:webHidden/>
+              </w:rPr>
+              <w:fldChar w:fldCharType="end"/>
+            </w:r>
+          </w:hyperlink>
+        </w:p>
+        <w:p>
+          <w:pPr>
+            <w:pStyle w:val="TDC2"/>
+            <w:tabs>
+              <w:tab w:val="right" w:leader="dot" w:pos="8494"/>
+            </w:tabs>
+            <w:rPr>
+              <w:rFonts w:asciiTheme="minorHAnsi" w:eastAsiaTheme="minorEastAsia" w:hAnsiTheme="minorHAnsi" w:cstheme="minorBidi"/>
+              <w:noProof/>
+              <w:kern w:val="2"/>
+              <w:sz w:val="24"/>
+              <w:szCs w:val="24"/>
+              <w14:ligatures w14:val="standardContextual"/>
+            </w:rPr>
+          </w:pPr>
+          <w:hyperlink w:anchor="_Toc239278346" w:history="1">
+            <w:r>
+              <w:rPr>
+                <w:rStyle w:val="Hipervnculo"/>
+                <w:b/>
+                <w:bCs/>
+                <w:noProof/>
+                <w:lang w:val="es-ES"/>
+              </w:rPr>
+              <w:t>1.2. Propósito y justificación</w:t>
+            </w:r>
+            <w:r>
+              <w:rPr>
+                <w:noProof/>
+                <w:webHidden/>
+              </w:rPr>
+              <w:tab/>
+            </w:r>
+            <w:r>
+              <w:rPr>
+                <w:noProof/>
+                <w:webHidden/>
+              </w:rPr>
+              <w:fldChar w:fldCharType="begin"/>
+            </w:r>
+            <w:r>
+              <w:rPr>
+                <w:noProof/>
+                <w:webHidden/>
+              </w:rPr>
+              <w:instrText xml:space="preserve"> PAGEREF _Toc239278346 \h </w:instrText>
+            </w:r>
+            <w:r>
+              <w:rPr>
+                <w:noProof/>
+                <w:webHidden/>
+              </w:rPr>
+            </w:r>
+            <w:r>
+              <w:rPr>
+                <w:noProof/>
+                <w:webHidden/>
+              </w:rPr>
+              <w:fldChar w:fldCharType="separate"/>
+            </w:r>
+            <w:r>
+              <w:rPr>
+                <w:noProof/>
+                <w:webHidden/>
+              </w:rPr>
+              <w:t>4</w:t>
+            </w:r>
+            <w:r>
+              <w:rPr>
+                <w:noProof/>
+                <w:webHidden/>
+              </w:rPr>
+              <w:fldChar w:fldCharType="end"/>
+            </w:r>
+          </w:hyperlink>
+        </w:p>
+        <w:p>
+          <w:pPr>
+            <w:pStyle w:val="TDC2"/>
+            <w:tabs>
+              <w:tab w:val="right" w:leader="dot" w:pos="8494"/>
+            </w:tabs>
+            <w:rPr>
+              <w:rFonts w:asciiTheme="minorHAnsi" w:eastAsiaTheme="minorEastAsia" w:hAnsiTheme="minorHAnsi" w:cstheme="minorBidi"/>
+              <w:noProof/>
+              <w:kern w:val="2"/>
+              <w:sz w:val="24"/>
+              <w:szCs w:val="24"/>
+              <w14:ligatures w14:val="standardContextual"/>
+            </w:rPr>
+          </w:pPr>
+          <w:hyperlink w:anchor="_Toc239278347" w:history="1">
+            <w:r>
+              <w:rPr>
+                <w:rStyle w:val="Hipervnculo"/>
+                <w:b/>
+                <w:bCs/>
+                <w:noProof/>
+              </w:rPr>
+              <w:t>1.3. Objetivos del Proyecto</w:t>
+            </w:r>
+            <w:r>
+              <w:rPr>
+                <w:noProof/>
+                <w:webHidden/>
+              </w:rPr>
+              <w:tab/>
+            </w:r>
+            <w:r>
+              <w:rPr>
+                <w:noProof/>
+                <w:webHidden/>
+              </w:rPr>
+              <w:fldChar w:fldCharType="begin"/>
+            </w:r>
+            <w:r>
+              <w:rPr>
+                <w:noProof/>
+                <w:webHidden/>
+              </w:rPr>
+              <w:instrText xml:space="preserve"> PAGEREF _Toc239278347 \h </w:instrText>
+            </w:r>
+            <w:r>
+              <w:rPr>
+                <w:noProof/>
+                <w:webHidden/>
+              </w:rPr>
+            </w:r>
+            <w:r>
+              <w:rPr>
+                <w:noProof/>
+                <w:webHidden/>
+              </w:rPr>
+              <w:fldChar w:fldCharType="separate"/>
+            </w:r>
+            <w:r>
+              <w:rPr>
+                <w:noProof/>
+                <w:webHidden/>
+              </w:rPr>
+              <w:t>4</w:t>
+            </w:r>
+            <w:r>
+              <w:rPr>
+                <w:noProof/>
+                <w:webHidden/>
+              </w:rPr>
+              <w:fldChar w:fldCharType="end"/>
+            </w:r>
+          </w:hyperlink>
+        </w:p>
+        <w:p>
+          <w:pPr>
+            <w:pStyle w:val="TDC2"/>
+            <w:tabs>
+              <w:tab w:val="right" w:leader="dot" w:pos="8494"/>
+            </w:tabs>
+            <w:rPr>
+              <w:rFonts w:asciiTheme="minorHAnsi" w:eastAsiaTheme="minorEastAsia" w:hAnsiTheme="minorHAnsi" w:cstheme="minorBidi"/>
+              <w:noProof/>
+              <w:kern w:val="2"/>
+              <w:sz w:val="24"/>
+              <w:szCs w:val="24"/>
+              <w14:ligatures w14:val="standardContextual"/>
+            </w:rPr>
+          </w:pPr>
+          <w:hyperlink w:anchor="_Toc239278348" w:history="1">
+            <w:r>
+              <w:rPr>
+                <w:rStyle w:val="Hipervnculo"/>
+                <w:b/>
+                <w:bCs/>
+                <w:noProof/>
+              </w:rPr>
+              <w:t>1.4. Alcance del Proyecto</w:t>
+            </w:r>
+            <w:r>
+              <w:rPr>
+                <w:noProof/>
+                <w:webHidden/>
+              </w:rPr>
+              <w:tab/>
+            </w:r>
+            <w:r>
+              <w:rPr>
+                <w:noProof/>
+                <w:webHidden/>
+              </w:rPr>
+              <w:fldChar w:fldCharType="begin"/>
+            </w:r>
+            <w:r>
+              <w:rPr>
+                <w:noProof/>
+                <w:webHidden/>
+              </w:rPr>
+              <w:instrText xml:space="preserve"> PAGEREF _Toc239278348 \h </w:instrText>
+            </w:r>
+            <w:r>
+              <w:rPr>
+                <w:noProof/>
+                <w:webHidden/>
+              </w:rPr>
+            </w:r>
+            <w:r>
+              <w:rPr>
+                <w:noProof/>
+                <w:webHidden/>
+              </w:rPr>
+              <w:fldChar w:fldCharType="separate"/>
+            </w:r>
+            <w:r>
+              <w:rPr>
+                <w:noProof/>
+                <w:webHidden/>
+              </w:rPr>
+              <w:t>4</w:t>
+            </w:r>
+            <w:r>
+              <w:rPr>
+                <w:noProof/>
+                <w:webHidden/>
+              </w:rPr>
+              <w:fldChar w:fldCharType="end"/>
+            </w:r>
+          </w:hyperlink>
+        </w:p>
+        <w:p>
+          <w:pPr>
+            <w:pStyle w:val="TDC2"/>
+            <w:tabs>
+              <w:tab w:val="right" w:leader="dot" w:pos="8494"/>
+            </w:tabs>
+            <w:rPr>
+              <w:rFonts w:asciiTheme="minorHAnsi" w:eastAsiaTheme="minorEastAsia" w:hAnsiTheme="minorHAnsi" w:cstheme="minorBidi"/>
+              <w:noProof/>
+              <w:kern w:val="2"/>
+              <w:sz w:val="24"/>
+              <w:szCs w:val="24"/>
+              <w14:ligatures w14:val="standardContextual"/>
+            </w:rPr>
+          </w:pPr>
+          <w:hyperlink w:anchor="_Toc239278349" w:history="1">
+            <w:r>
+              <w:rPr>
+                <w:rStyle w:val="Hipervnculo"/>
+                <w:b/>
+                <w:bCs/>
+                <w:noProof/>
+              </w:rPr>
+              <w:t>1.5. Supuestos y Restricciones</w:t>
+            </w:r>
+            <w:r>
+              <w:rPr>
+                <w:noProof/>
+                <w:webHidden/>
+              </w:rPr>
+              <w:tab/>
+            </w:r>
+            <w:r>
+              <w:rPr>
+                <w:noProof/>
+                <w:webHidden/>
+              </w:rPr>
+              <w:fldChar w:fldCharType="begin"/>
+            </w:r>
+            <w:r>
+              <w:rPr>
+                <w:noProof/>
+                <w:webHidden/>
+              </w:rPr>
+              <w:instrText xml:space="preserve"> PAGEREF _Toc239278349 \h </w:instrText>
+            </w:r>
+            <w:r>
+              <w:rPr>
+                <w:noProof/>
+                <w:webHidden/>
+              </w:rPr>
+            </w:r>
+            <w:r>
+              <w:rPr>
+                <w:noProof/>
+                <w:webHidden/>
+              </w:rPr>
+              <w:fldChar w:fldCharType="separate"/>
+            </w:r>
+            <w:r>
+              <w:rPr>
+                <w:noProof/>
+                <w:webHidden/>
+              </w:rPr>
+              <w:t>5</w:t>
             </w:r>
             <w:r>
               <w:rPr>
@@ -887,10 +1268,15 @@
               <w:tab w:val="right" w:leader="dot" w:pos="8494"/>
             </w:tabs>
             <w:rPr>
+              <w:rFonts w:asciiTheme="minorHAnsi" w:eastAsiaTheme="minorEastAsia" w:hAnsiTheme="minorHAnsi" w:cstheme="minorBidi"/>
               <w:noProof/>
+              <w:kern w:val="2"/>
+              <w:sz w:val="24"/>
+              <w:szCs w:val="24"/>
+              <w14:ligatures w14:val="standardContextual"/>
             </w:rPr>
           </w:pPr>
-          <w:hyperlink w:anchor="_Toc239067882" w:history="1">
+          <w:hyperlink w:anchor="_Toc239278350" w:history="1">
             <w:r>
               <w:rPr>
                 <w:rStyle w:val="Hipervnculo"/>
@@ -920,7 +1306,7 @@
                 <w:noProof/>
                 <w:webHidden/>
               </w:rPr>
-              <w:instrText xml:space="preserve"> PAGEREF _Toc239067882 \h </w:instrText>
+              <w:instrText xml:space="preserve"> PAGEREF _Toc239278350 \h </w:instrText>
             </w:r>
             <w:r>
               <w:rPr>
@@ -940,7 +1326,7 @@
                 <w:noProof/>
                 <w:webHidden/>
               </w:rPr>
-              <w:t>4</w:t>
+              <w:t>6</w:t>
             </w:r>
             <w:r>
               <w:rPr>
@@ -958,10 +1344,15 @@
               <w:tab w:val="right" w:leader="dot" w:pos="8494"/>
             </w:tabs>
             <w:rPr>
+              <w:rFonts w:asciiTheme="minorHAnsi" w:eastAsiaTheme="minorEastAsia" w:hAnsiTheme="minorHAnsi" w:cstheme="minorBidi"/>
               <w:noProof/>
+              <w:kern w:val="2"/>
+              <w:sz w:val="24"/>
+              <w:szCs w:val="24"/>
+              <w14:ligatures w14:val="standardContextual"/>
             </w:rPr>
           </w:pPr>
-          <w:hyperlink w:anchor="_Toc239067883" w:history="1">
+          <w:hyperlink w:anchor="_Toc239278351" w:history="1">
             <w:r>
               <w:rPr>
                 <w:rStyle w:val="Hipervnculo"/>
@@ -991,7 +1382,7 @@
                 <w:noProof/>
                 <w:webHidden/>
               </w:rPr>
-              <w:instrText xml:space="preserve"> PAGEREF _Toc239067883 \h </w:instrText>
+              <w:instrText xml:space="preserve"> PAGEREF _Toc239278351 \h </w:instrText>
             </w:r>
             <w:r>
               <w:rPr>
@@ -1011,7 +1402,7 @@
                 <w:noProof/>
                 <w:webHidden/>
               </w:rPr>
-              <w:t>4</w:t>
+              <w:t>6</w:t>
             </w:r>
             <w:r>
               <w:rPr>
@@ -1029,10 +1420,15 @@
               <w:tab w:val="right" w:leader="dot" w:pos="8494"/>
             </w:tabs>
             <w:rPr>
+              <w:rFonts w:asciiTheme="minorHAnsi" w:eastAsiaTheme="minorEastAsia" w:hAnsiTheme="minorHAnsi" w:cstheme="minorBidi"/>
               <w:noProof/>
+              <w:kern w:val="2"/>
+              <w:sz w:val="24"/>
+              <w:szCs w:val="24"/>
+              <w14:ligatures w14:val="standardContextual"/>
             </w:rPr>
           </w:pPr>
-          <w:hyperlink w:anchor="_Toc239067884" w:history="1">
+          <w:hyperlink w:anchor="_Toc239278352" w:history="1">
             <w:r>
               <w:rPr>
                 <w:rStyle w:val="Hipervnculo"/>
@@ -1061,7 +1457,7 @@
                 <w:noProof/>
                 <w:webHidden/>
               </w:rPr>
-              <w:instrText xml:space="preserve"> PAGEREF _Toc239067884 \h </w:instrText>
+              <w:instrText xml:space="preserve"> PAGEREF _Toc239278352 \h </w:instrText>
             </w:r>
             <w:r>
               <w:rPr>
@@ -1081,7 +1477,7 @@
                 <w:noProof/>
                 <w:webHidden/>
               </w:rPr>
-              <w:t>5</w:t>
+              <w:t>7</w:t>
             </w:r>
             <w:r>
               <w:rPr>
@@ -1099,10 +1495,15 @@
               <w:tab w:val="right" w:leader="dot" w:pos="8494"/>
             </w:tabs>
             <w:rPr>
+              <w:rFonts w:asciiTheme="minorHAnsi" w:eastAsiaTheme="minorEastAsia" w:hAnsiTheme="minorHAnsi" w:cstheme="minorBidi"/>
               <w:noProof/>
+              <w:kern w:val="2"/>
+              <w:sz w:val="24"/>
+              <w:szCs w:val="24"/>
+              <w14:ligatures w14:val="standardContextual"/>
             </w:rPr>
           </w:pPr>
-          <w:hyperlink w:anchor="_Toc239067885" w:history="1">
+          <w:hyperlink w:anchor="_Toc239278353" w:history="1">
             <w:r>
               <w:rPr>
                 <w:rStyle w:val="Hipervnculo"/>
@@ -1131,7 +1532,7 @@
                 <w:noProof/>
                 <w:webHidden/>
               </w:rPr>
-              <w:instrText xml:space="preserve"> PAGEREF _Toc239067885 \h </w:instrText>
+              <w:instrText xml:space="preserve"> PAGEREF _Toc239278353 \h </w:instrText>
             </w:r>
             <w:r>
               <w:rPr>
@@ -1151,7 +1552,7 @@
                 <w:noProof/>
                 <w:webHidden/>
               </w:rPr>
-              <w:t>7</w:t>
+              <w:t>9</w:t>
             </w:r>
             <w:r>
               <w:rPr>
@@ -1169,10 +1570,15 @@
               <w:tab w:val="right" w:leader="dot" w:pos="8494"/>
             </w:tabs>
             <w:rPr>
+              <w:rFonts w:asciiTheme="minorHAnsi" w:eastAsiaTheme="minorEastAsia" w:hAnsiTheme="minorHAnsi" w:cstheme="minorBidi"/>
               <w:noProof/>
+              <w:kern w:val="2"/>
+              <w:sz w:val="24"/>
+              <w:szCs w:val="24"/>
+              <w14:ligatures w14:val="standardContextual"/>
             </w:rPr>
           </w:pPr>
-          <w:hyperlink w:anchor="_Toc239067886" w:history="1">
+          <w:hyperlink w:anchor="_Toc239278354" w:history="1">
             <w:r>
               <w:rPr>
                 <w:rStyle w:val="Hipervnculo"/>
@@ -1201,7 +1607,7 @@
                 <w:noProof/>
                 <w:webHidden/>
               </w:rPr>
-              <w:instrText xml:space="preserve"> PAGEREF _Toc239067886 \h </w:instrText>
+              <w:instrText xml:space="preserve"> PAGEREF _Toc239278354 \h </w:instrText>
             </w:r>
             <w:r>
               <w:rPr>
@@ -1221,7 +1627,7 @@
                 <w:noProof/>
                 <w:webHidden/>
               </w:rPr>
-              <w:t>8</w:t>
+              <w:t>10</w:t>
             </w:r>
             <w:r>
               <w:rPr>
@@ -1239,10 +1645,15 @@
               <w:tab w:val="right" w:leader="dot" w:pos="8494"/>
             </w:tabs>
             <w:rPr>
+              <w:rFonts w:asciiTheme="minorHAnsi" w:eastAsiaTheme="minorEastAsia" w:hAnsiTheme="minorHAnsi" w:cstheme="minorBidi"/>
               <w:noProof/>
+              <w:kern w:val="2"/>
+              <w:sz w:val="24"/>
+              <w:szCs w:val="24"/>
+              <w14:ligatures w14:val="standardContextual"/>
             </w:rPr>
           </w:pPr>
-          <w:hyperlink w:anchor="_Toc239067887" w:history="1">
+          <w:hyperlink w:anchor="_Toc239278355" w:history="1">
             <w:r>
               <w:rPr>
                 <w:rStyle w:val="Hipervnculo"/>
@@ -1271,7 +1682,7 @@
                 <w:noProof/>
                 <w:webHidden/>
               </w:rPr>
-              <w:instrText xml:space="preserve"> PAGEREF _Toc239067887 \h </w:instrText>
+              <w:instrText xml:space="preserve"> PAGEREF _Toc239278355 \h </w:instrText>
             </w:r>
             <w:r>
               <w:rPr>
@@ -1291,7 +1702,7 @@
                 <w:noProof/>
                 <w:webHidden/>
               </w:rPr>
-              <w:t>8</w:t>
+              <w:t>10</w:t>
             </w:r>
             <w:r>
               <w:rPr>
@@ -1309,10 +1720,15 @@
               <w:tab w:val="right" w:leader="dot" w:pos="8494"/>
             </w:tabs>
             <w:rPr>
+              <w:rFonts w:asciiTheme="minorHAnsi" w:eastAsiaTheme="minorEastAsia" w:hAnsiTheme="minorHAnsi" w:cstheme="minorBidi"/>
               <w:noProof/>
+              <w:kern w:val="2"/>
+              <w:sz w:val="24"/>
+              <w:szCs w:val="24"/>
+              <w14:ligatures w14:val="standardContextual"/>
             </w:rPr>
           </w:pPr>
-          <w:hyperlink w:anchor="_Toc239067888" w:history="1">
+          <w:hyperlink w:anchor="_Toc239278356" w:history="1">
             <w:r>
               <w:rPr>
                 <w:rStyle w:val="Hipervnculo"/>
@@ -1341,7 +1757,7 @@
                 <w:noProof/>
                 <w:webHidden/>
               </w:rPr>
-              <w:instrText xml:space="preserve"> PAGEREF _Toc239067888 \h </w:instrText>
+              <w:instrText xml:space="preserve"> PAGEREF _Toc239278356 \h </w:instrText>
             </w:r>
             <w:r>
               <w:rPr>
@@ -1361,7 +1777,7 @@
                 <w:noProof/>
                 <w:webHidden/>
               </w:rPr>
-              <w:t>8</w:t>
+              <w:t>10</w:t>
             </w:r>
             <w:r>
               <w:rPr>
@@ -1379,10 +1795,15 @@
               <w:tab w:val="right" w:leader="dot" w:pos="8494"/>
             </w:tabs>
             <w:rPr>
+              <w:rFonts w:asciiTheme="minorHAnsi" w:eastAsiaTheme="minorEastAsia" w:hAnsiTheme="minorHAnsi" w:cstheme="minorBidi"/>
               <w:noProof/>
+              <w:kern w:val="2"/>
+              <w:sz w:val="24"/>
+              <w:szCs w:val="24"/>
+              <w14:ligatures w14:val="standardContextual"/>
             </w:rPr>
           </w:pPr>
-          <w:hyperlink w:anchor="_Toc239067889" w:history="1">
+          <w:hyperlink w:anchor="_Toc239278357" w:history="1">
             <w:r>
               <w:rPr>
                 <w:rStyle w:val="Hipervnculo"/>
@@ -1411,7 +1832,7 @@
                 <w:noProof/>
                 <w:webHidden/>
               </w:rPr>
-              <w:instrText xml:space="preserve"> PAGEREF _Toc239067889 \h </w:instrText>
+              <w:instrText xml:space="preserve"> PAGEREF _Toc239278357 \h </w:instrText>
             </w:r>
             <w:r>
               <w:rPr>
@@ -1431,7 +1852,7 @@
                 <w:noProof/>
                 <w:webHidden/>
               </w:rPr>
-              <w:t>11</w:t>
+              <w:t>13</w:t>
             </w:r>
             <w:r>
               <w:rPr>
@@ -1449,10 +1870,15 @@
               <w:tab w:val="right" w:leader="dot" w:pos="8494"/>
             </w:tabs>
             <w:rPr>
+              <w:rFonts w:asciiTheme="minorHAnsi" w:eastAsiaTheme="minorEastAsia" w:hAnsiTheme="minorHAnsi" w:cstheme="minorBidi"/>
               <w:noProof/>
+              <w:kern w:val="2"/>
+              <w:sz w:val="24"/>
+              <w:szCs w:val="24"/>
+              <w14:ligatures w14:val="standardContextual"/>
             </w:rPr>
           </w:pPr>
-          <w:hyperlink w:anchor="_Toc239067890" w:history="1">
+          <w:hyperlink w:anchor="_Toc239278358" w:history="1">
             <w:r>
               <w:rPr>
                 <w:rStyle w:val="Hipervnculo"/>
@@ -1481,7 +1907,7 @@
                 <w:noProof/>
                 <w:webHidden/>
               </w:rPr>
-              <w:instrText xml:space="preserve"> PAGEREF _Toc239067890 \h </w:instrText>
+              <w:instrText xml:space="preserve"> PAGEREF _Toc239278358 \h </w:instrText>
             </w:r>
             <w:r>
               <w:rPr>
@@ -1501,7 +1927,7 @@
                 <w:noProof/>
                 <w:webHidden/>
               </w:rPr>
-              <w:t>11</w:t>
+              <w:t>13</w:t>
             </w:r>
             <w:r>
               <w:rPr>
@@ -1519,10 +1945,15 @@
               <w:tab w:val="right" w:leader="dot" w:pos="8494"/>
             </w:tabs>
             <w:rPr>
+              <w:rFonts w:asciiTheme="minorHAnsi" w:eastAsiaTheme="minorEastAsia" w:hAnsiTheme="minorHAnsi" w:cstheme="minorBidi"/>
               <w:noProof/>
+              <w:kern w:val="2"/>
+              <w:sz w:val="24"/>
+              <w:szCs w:val="24"/>
+              <w14:ligatures w14:val="standardContextual"/>
             </w:rPr>
           </w:pPr>
-          <w:hyperlink w:anchor="_Toc239067891" w:history="1">
+          <w:hyperlink w:anchor="_Toc239278359" w:history="1">
             <w:r>
               <w:rPr>
                 <w:rStyle w:val="Hipervnculo"/>
@@ -1551,7 +1982,7 @@
                 <w:noProof/>
                 <w:webHidden/>
               </w:rPr>
-              <w:instrText xml:space="preserve"> PAGEREF _Toc239067891 \h </w:instrText>
+              <w:instrText xml:space="preserve"> PAGEREF _Toc239278359 \h </w:instrText>
             </w:r>
             <w:r>
               <w:rPr>
@@ -1571,7 +2002,7 @@
                 <w:noProof/>
                 <w:webHidden/>
               </w:rPr>
-              <w:t>12</w:t>
+              <w:t>14</w:t>
             </w:r>
             <w:r>
               <w:rPr>
@@ -1589,10 +2020,15 @@
               <w:tab w:val="right" w:leader="dot" w:pos="8494"/>
             </w:tabs>
             <w:rPr>
+              <w:rFonts w:asciiTheme="minorHAnsi" w:eastAsiaTheme="minorEastAsia" w:hAnsiTheme="minorHAnsi" w:cstheme="minorBidi"/>
               <w:noProof/>
+              <w:kern w:val="2"/>
+              <w:sz w:val="24"/>
+              <w:szCs w:val="24"/>
+              <w14:ligatures w14:val="standardContextual"/>
             </w:rPr>
           </w:pPr>
-          <w:hyperlink w:anchor="_Toc239067892" w:history="1">
+          <w:hyperlink w:anchor="_Toc239278360" w:history="1">
             <w:r>
               <w:rPr>
                 <w:rStyle w:val="Hipervnculo"/>
@@ -1621,7 +2057,7 @@
                 <w:noProof/>
                 <w:webHidden/>
               </w:rPr>
-              <w:instrText xml:space="preserve"> PAGEREF _Toc239067892 \h </w:instrText>
+              <w:instrText xml:space="preserve"> PAGEREF _Toc239278360 \h </w:instrText>
             </w:r>
             <w:r>
               <w:rPr>
@@ -1641,7 +2077,7 @@
                 <w:noProof/>
                 <w:webHidden/>
               </w:rPr>
-              <w:t>13</w:t>
+              <w:t>15</w:t>
             </w:r>
             <w:r>
               <w:rPr>
@@ -1659,10 +2095,15 @@
               <w:tab w:val="right" w:leader="dot" w:pos="8494"/>
             </w:tabs>
             <w:rPr>
+              <w:rFonts w:asciiTheme="minorHAnsi" w:eastAsiaTheme="minorEastAsia" w:hAnsiTheme="minorHAnsi" w:cstheme="minorBidi"/>
               <w:noProof/>
+              <w:kern w:val="2"/>
+              <w:sz w:val="24"/>
+              <w:szCs w:val="24"/>
+              <w14:ligatures w14:val="standardContextual"/>
             </w:rPr>
           </w:pPr>
-          <w:hyperlink w:anchor="_Toc239067893" w:history="1">
+          <w:hyperlink w:anchor="_Toc239278361" w:history="1">
             <w:r>
               <w:rPr>
                 <w:rStyle w:val="Hipervnculo"/>
@@ -1691,7 +2132,7 @@
                 <w:noProof/>
                 <w:webHidden/>
               </w:rPr>
-              <w:instrText xml:space="preserve"> PAGEREF _Toc239067893 \h </w:instrText>
+              <w:instrText xml:space="preserve"> PAGEREF _Toc239278361 \h </w:instrText>
             </w:r>
             <w:r>
               <w:rPr>
@@ -1711,7 +2152,7 @@
                 <w:noProof/>
                 <w:webHidden/>
               </w:rPr>
-              <w:t>15</w:t>
+              <w:t>18</w:t>
             </w:r>
             <w:r>
               <w:rPr>
@@ -1729,10 +2170,15 @@
               <w:tab w:val="right" w:leader="dot" w:pos="8494"/>
             </w:tabs>
             <w:rPr>
+              <w:rFonts w:asciiTheme="minorHAnsi" w:eastAsiaTheme="minorEastAsia" w:hAnsiTheme="minorHAnsi" w:cstheme="minorBidi"/>
               <w:noProof/>
+              <w:kern w:val="2"/>
+              <w:sz w:val="24"/>
+              <w:szCs w:val="24"/>
+              <w14:ligatures w14:val="standardContextual"/>
             </w:rPr>
           </w:pPr>
-          <w:hyperlink w:anchor="_Toc239067894" w:history="1">
+          <w:hyperlink w:anchor="_Toc239278362" w:history="1">
             <w:r>
               <w:rPr>
                 <w:rStyle w:val="Hipervnculo"/>
@@ -1761,7 +2207,7 @@
                 <w:noProof/>
                 <w:webHidden/>
               </w:rPr>
-              <w:instrText xml:space="preserve"> PAGEREF _Toc239067894 \h </w:instrText>
+              <w:instrText xml:space="preserve"> PAGEREF _Toc239278362 \h </w:instrText>
             </w:r>
             <w:r>
               <w:rPr>
@@ -1781,7 +2227,7 @@
                 <w:noProof/>
                 <w:webHidden/>
               </w:rPr>
-              <w:t>16</w:t>
+              <w:t>18</w:t>
             </w:r>
             <w:r>
               <w:rPr>
@@ -1799,10 +2245,15 @@
               <w:tab w:val="right" w:leader="dot" w:pos="8494"/>
             </w:tabs>
             <w:rPr>
+              <w:rFonts w:asciiTheme="minorHAnsi" w:eastAsiaTheme="minorEastAsia" w:hAnsiTheme="minorHAnsi" w:cstheme="minorBidi"/>
               <w:noProof/>
+              <w:kern w:val="2"/>
+              <w:sz w:val="24"/>
+              <w:szCs w:val="24"/>
+              <w14:ligatures w14:val="standardContextual"/>
             </w:rPr>
           </w:pPr>
-          <w:hyperlink w:anchor="_Toc239067895" w:history="1">
+          <w:hyperlink w:anchor="_Toc239278363" w:history="1">
             <w:r>
               <w:rPr>
                 <w:rStyle w:val="Hipervnculo"/>
@@ -1831,7 +2282,7 @@
                 <w:noProof/>
                 <w:webHidden/>
               </w:rPr>
-              <w:instrText xml:space="preserve"> PAGEREF _Toc239067895 \h </w:instrText>
+              <w:instrText xml:space="preserve"> PAGEREF _Toc239278363 \h </w:instrText>
             </w:r>
             <w:r>
               <w:rPr>
@@ -1851,7 +2302,7 @@
                 <w:noProof/>
                 <w:webHidden/>
               </w:rPr>
-              <w:t>17</w:t>
+              <w:t>20</w:t>
             </w:r>
             <w:r>
               <w:rPr>
@@ -1869,10 +2320,15 @@
               <w:tab w:val="right" w:leader="dot" w:pos="8494"/>
             </w:tabs>
             <w:rPr>
+              <w:rFonts w:asciiTheme="minorHAnsi" w:eastAsiaTheme="minorEastAsia" w:hAnsiTheme="minorHAnsi" w:cstheme="minorBidi"/>
               <w:noProof/>
+              <w:kern w:val="2"/>
+              <w:sz w:val="24"/>
+              <w:szCs w:val="24"/>
+              <w14:ligatures w14:val="standardContextual"/>
             </w:rPr>
           </w:pPr>
-          <w:hyperlink w:anchor="_Toc239067896" w:history="1">
+          <w:hyperlink w:anchor="_Toc239278364" w:history="1">
             <w:r>
               <w:rPr>
                 <w:rStyle w:val="Hipervnculo"/>
@@ -1901,7 +2357,7 @@
                 <w:noProof/>
                 <w:webHidden/>
               </w:rPr>
-              <w:instrText xml:space="preserve"> PAGEREF _Toc239067896 \h </w:instrText>
+              <w:instrText xml:space="preserve"> PAGEREF _Toc239278364 \h </w:instrText>
             </w:r>
             <w:r>
               <w:rPr>
@@ -1921,7 +2377,7 @@
                 <w:noProof/>
                 <w:webHidden/>
               </w:rPr>
-              <w:t>18</w:t>
+              <w:t>21</w:t>
             </w:r>
             <w:r>
               <w:rPr>
@@ -1939,10 +2395,15 @@
               <w:tab w:val="right" w:leader="dot" w:pos="8494"/>
             </w:tabs>
             <w:rPr>
+              <w:rFonts w:asciiTheme="minorHAnsi" w:eastAsiaTheme="minorEastAsia" w:hAnsiTheme="minorHAnsi" w:cstheme="minorBidi"/>
               <w:noProof/>
+              <w:kern w:val="2"/>
+              <w:sz w:val="24"/>
+              <w:szCs w:val="24"/>
+              <w14:ligatures w14:val="standardContextual"/>
             </w:rPr>
           </w:pPr>
-          <w:hyperlink w:anchor="_Toc239067897" w:history="1">
+          <w:hyperlink w:anchor="_Toc239278365" w:history="1">
             <w:r>
               <w:rPr>
                 <w:rStyle w:val="Hipervnculo"/>
@@ -1981,7 +2442,7 @@
                 <w:noProof/>
                 <w:webHidden/>
               </w:rPr>
-              <w:instrText xml:space="preserve"> PAGEREF _Toc239067897 \h </w:instrText>
+              <w:instrText xml:space="preserve"> PAGEREF _Toc239278365 \h </w:instrText>
             </w:r>
             <w:r>
               <w:rPr>
@@ -2001,7 +2462,1067 @@
                 <w:noProof/>
                 <w:webHidden/>
               </w:rPr>
-              <w:t>18</w:t>
+              <w:t>21</w:t>
+            </w:r>
+            <w:r>
+              <w:rPr>
+                <w:noProof/>
+                <w:webHidden/>
+              </w:rPr>
+              <w:fldChar w:fldCharType="end"/>
+            </w:r>
+          </w:hyperlink>
+        </w:p>
+        <w:p>
+          <w:pPr>
+            <w:pStyle w:val="TDC2"/>
+            <w:tabs>
+              <w:tab w:val="right" w:leader="dot" w:pos="8494"/>
+            </w:tabs>
+            <w:rPr>
+              <w:rFonts w:asciiTheme="minorHAnsi" w:eastAsiaTheme="minorEastAsia" w:hAnsiTheme="minorHAnsi" w:cstheme="minorBidi"/>
+              <w:noProof/>
+              <w:kern w:val="2"/>
+              <w:sz w:val="24"/>
+              <w:szCs w:val="24"/>
+              <w14:ligatures w14:val="standardContextual"/>
+            </w:rPr>
+          </w:pPr>
+          <w:hyperlink w:anchor="_Toc239278366" w:history="1">
+            <w:r>
+              <w:rPr>
+                <w:rStyle w:val="Hipervnculo"/>
+                <w:b/>
+                <w:bCs/>
+                <w:noProof/>
+              </w:rPr>
+              <w:t>6.2. Diseño Lógico</w:t>
+            </w:r>
+            <w:r>
+              <w:rPr>
+                <w:noProof/>
+                <w:webHidden/>
+              </w:rPr>
+              <w:tab/>
+            </w:r>
+            <w:r>
+              <w:rPr>
+                <w:noProof/>
+                <w:webHidden/>
+              </w:rPr>
+              <w:fldChar w:fldCharType="begin"/>
+            </w:r>
+            <w:r>
+              <w:rPr>
+                <w:noProof/>
+                <w:webHidden/>
+              </w:rPr>
+              <w:instrText xml:space="preserve"> PAGEREF _Toc239278366 \h </w:instrText>
+            </w:r>
+            <w:r>
+              <w:rPr>
+                <w:noProof/>
+                <w:webHidden/>
+              </w:rPr>
+            </w:r>
+            <w:r>
+              <w:rPr>
+                <w:noProof/>
+                <w:webHidden/>
+              </w:rPr>
+              <w:fldChar w:fldCharType="separate"/>
+            </w:r>
+            <w:r>
+              <w:rPr>
+                <w:noProof/>
+                <w:webHidden/>
+              </w:rPr>
+              <w:t>21</w:t>
+            </w:r>
+            <w:r>
+              <w:rPr>
+                <w:noProof/>
+                <w:webHidden/>
+              </w:rPr>
+              <w:fldChar w:fldCharType="end"/>
+            </w:r>
+          </w:hyperlink>
+        </w:p>
+        <w:p>
+          <w:pPr>
+            <w:pStyle w:val="TDC2"/>
+            <w:tabs>
+              <w:tab w:val="right" w:leader="dot" w:pos="8494"/>
+            </w:tabs>
+            <w:rPr>
+              <w:rFonts w:asciiTheme="minorHAnsi" w:eastAsiaTheme="minorEastAsia" w:hAnsiTheme="minorHAnsi" w:cstheme="minorBidi"/>
+              <w:noProof/>
+              <w:kern w:val="2"/>
+              <w:sz w:val="24"/>
+              <w:szCs w:val="24"/>
+              <w14:ligatures w14:val="standardContextual"/>
+            </w:rPr>
+          </w:pPr>
+          <w:hyperlink w:anchor="_Toc239278367" w:history="1">
+            <w:r>
+              <w:rPr>
+                <w:rStyle w:val="Hipervnculo"/>
+                <w:b/>
+                <w:bCs/>
+                <w:noProof/>
+              </w:rPr>
+              <w:t>6.3. Diseño físico</w:t>
+            </w:r>
+            <w:r>
+              <w:rPr>
+                <w:noProof/>
+                <w:webHidden/>
+              </w:rPr>
+              <w:tab/>
+            </w:r>
+            <w:r>
+              <w:rPr>
+                <w:noProof/>
+                <w:webHidden/>
+              </w:rPr>
+              <w:fldChar w:fldCharType="begin"/>
+            </w:r>
+            <w:r>
+              <w:rPr>
+                <w:noProof/>
+                <w:webHidden/>
+              </w:rPr>
+              <w:instrText xml:space="preserve"> PAGEREF _Toc239278367 \h </w:instrText>
+            </w:r>
+            <w:r>
+              <w:rPr>
+                <w:noProof/>
+                <w:webHidden/>
+              </w:rPr>
+            </w:r>
+            <w:r>
+              <w:rPr>
+                <w:noProof/>
+                <w:webHidden/>
+              </w:rPr>
+              <w:fldChar w:fldCharType="separate"/>
+            </w:r>
+            <w:r>
+              <w:rPr>
+                <w:noProof/>
+                <w:webHidden/>
+              </w:rPr>
+              <w:t>22</w:t>
+            </w:r>
+            <w:r>
+              <w:rPr>
+                <w:noProof/>
+                <w:webHidden/>
+              </w:rPr>
+              <w:fldChar w:fldCharType="end"/>
+            </w:r>
+          </w:hyperlink>
+        </w:p>
+        <w:p>
+          <w:pPr>
+            <w:pStyle w:val="TDC2"/>
+            <w:tabs>
+              <w:tab w:val="right" w:leader="dot" w:pos="8494"/>
+            </w:tabs>
+            <w:rPr>
+              <w:rFonts w:asciiTheme="minorHAnsi" w:eastAsiaTheme="minorEastAsia" w:hAnsiTheme="minorHAnsi" w:cstheme="minorBidi"/>
+              <w:noProof/>
+              <w:kern w:val="2"/>
+              <w:sz w:val="24"/>
+              <w:szCs w:val="24"/>
+              <w14:ligatures w14:val="standardContextual"/>
+            </w:rPr>
+          </w:pPr>
+          <w:hyperlink w:anchor="_Toc239278368" w:history="1">
+            <w:r>
+              <w:rPr>
+                <w:rStyle w:val="Hipervnculo"/>
+                <w:b/>
+                <w:bCs/>
+                <w:noProof/>
+              </w:rPr>
+              <w:t>6.4. Diccionario de datos</w:t>
+            </w:r>
+            <w:r>
+              <w:rPr>
+                <w:noProof/>
+                <w:webHidden/>
+              </w:rPr>
+              <w:tab/>
+            </w:r>
+            <w:r>
+              <w:rPr>
+                <w:noProof/>
+                <w:webHidden/>
+              </w:rPr>
+              <w:fldChar w:fldCharType="begin"/>
+            </w:r>
+            <w:r>
+              <w:rPr>
+                <w:noProof/>
+                <w:webHidden/>
+              </w:rPr>
+              <w:instrText xml:space="preserve"> PAGEREF _Toc239278368 \h </w:instrText>
+            </w:r>
+            <w:r>
+              <w:rPr>
+                <w:noProof/>
+                <w:webHidden/>
+              </w:rPr>
+            </w:r>
+            <w:r>
+              <w:rPr>
+                <w:noProof/>
+                <w:webHidden/>
+              </w:rPr>
+              <w:fldChar w:fldCharType="separate"/>
+            </w:r>
+            <w:r>
+              <w:rPr>
+                <w:noProof/>
+                <w:webHidden/>
+              </w:rPr>
+              <w:t>24</w:t>
+            </w:r>
+            <w:r>
+              <w:rPr>
+                <w:noProof/>
+                <w:webHidden/>
+              </w:rPr>
+              <w:fldChar w:fldCharType="end"/>
+            </w:r>
+          </w:hyperlink>
+        </w:p>
+        <w:p>
+          <w:pPr>
+            <w:pStyle w:val="TDC1"/>
+            <w:tabs>
+              <w:tab w:val="right" w:leader="dot" w:pos="8494"/>
+            </w:tabs>
+            <w:rPr>
+              <w:rFonts w:asciiTheme="minorHAnsi" w:eastAsiaTheme="minorEastAsia" w:hAnsiTheme="minorHAnsi" w:cstheme="minorBidi"/>
+              <w:noProof/>
+              <w:kern w:val="2"/>
+              <w:sz w:val="24"/>
+              <w:szCs w:val="24"/>
+              <w14:ligatures w14:val="standardContextual"/>
+            </w:rPr>
+          </w:pPr>
+          <w:hyperlink w:anchor="_Toc239278369" w:history="1">
+            <w:r>
+              <w:rPr>
+                <w:rStyle w:val="Hipervnculo"/>
+                <w:b/>
+                <w:bCs/>
+                <w:noProof/>
+              </w:rPr>
+              <w:t>7. Desarrollo y sprints</w:t>
+            </w:r>
+            <w:r>
+              <w:rPr>
+                <w:noProof/>
+                <w:webHidden/>
+              </w:rPr>
+              <w:tab/>
+            </w:r>
+            <w:r>
+              <w:rPr>
+                <w:noProof/>
+                <w:webHidden/>
+              </w:rPr>
+              <w:fldChar w:fldCharType="begin"/>
+            </w:r>
+            <w:r>
+              <w:rPr>
+                <w:noProof/>
+                <w:webHidden/>
+              </w:rPr>
+              <w:instrText xml:space="preserve"> PAGEREF _Toc239278369 \h </w:instrText>
+            </w:r>
+            <w:r>
+              <w:rPr>
+                <w:noProof/>
+                <w:webHidden/>
+              </w:rPr>
+            </w:r>
+            <w:r>
+              <w:rPr>
+                <w:noProof/>
+                <w:webHidden/>
+              </w:rPr>
+              <w:fldChar w:fldCharType="separate"/>
+            </w:r>
+            <w:r>
+              <w:rPr>
+                <w:noProof/>
+                <w:webHidden/>
+              </w:rPr>
+              <w:t>30</w:t>
+            </w:r>
+            <w:r>
+              <w:rPr>
+                <w:noProof/>
+                <w:webHidden/>
+              </w:rPr>
+              <w:fldChar w:fldCharType="end"/>
+            </w:r>
+          </w:hyperlink>
+        </w:p>
+        <w:p>
+          <w:pPr>
+            <w:pStyle w:val="TDC2"/>
+            <w:tabs>
+              <w:tab w:val="right" w:leader="dot" w:pos="8494"/>
+            </w:tabs>
+            <w:rPr>
+              <w:rFonts w:asciiTheme="minorHAnsi" w:eastAsiaTheme="minorEastAsia" w:hAnsiTheme="minorHAnsi" w:cstheme="minorBidi"/>
+              <w:noProof/>
+              <w:kern w:val="2"/>
+              <w:sz w:val="24"/>
+              <w:szCs w:val="24"/>
+              <w14:ligatures w14:val="standardContextual"/>
+            </w:rPr>
+          </w:pPr>
+          <w:hyperlink w:anchor="_Toc239278370" w:history="1">
+            <w:r>
+              <w:rPr>
+                <w:rStyle w:val="Hipervnculo"/>
+                <w:b/>
+                <w:bCs/>
+                <w:noProof/>
+              </w:rPr>
+              <w:t>7.1. Sprint 0 – Fase de inicio y entorno:</w:t>
+            </w:r>
+            <w:r>
+              <w:rPr>
+                <w:noProof/>
+                <w:webHidden/>
+              </w:rPr>
+              <w:tab/>
+            </w:r>
+            <w:r>
+              <w:rPr>
+                <w:noProof/>
+                <w:webHidden/>
+              </w:rPr>
+              <w:fldChar w:fldCharType="begin"/>
+            </w:r>
+            <w:r>
+              <w:rPr>
+                <w:noProof/>
+                <w:webHidden/>
+              </w:rPr>
+              <w:instrText xml:space="preserve"> PAGEREF _Toc239278370 \h </w:instrText>
+            </w:r>
+            <w:r>
+              <w:rPr>
+                <w:noProof/>
+                <w:webHidden/>
+              </w:rPr>
+            </w:r>
+            <w:r>
+              <w:rPr>
+                <w:noProof/>
+                <w:webHidden/>
+              </w:rPr>
+              <w:fldChar w:fldCharType="separate"/>
+            </w:r>
+            <w:r>
+              <w:rPr>
+                <w:noProof/>
+                <w:webHidden/>
+              </w:rPr>
+              <w:t>30</w:t>
+            </w:r>
+            <w:r>
+              <w:rPr>
+                <w:noProof/>
+                <w:webHidden/>
+              </w:rPr>
+              <w:fldChar w:fldCharType="end"/>
+            </w:r>
+          </w:hyperlink>
+        </w:p>
+        <w:p>
+          <w:pPr>
+            <w:pStyle w:val="TDC2"/>
+            <w:tabs>
+              <w:tab w:val="right" w:leader="dot" w:pos="8494"/>
+            </w:tabs>
+            <w:rPr>
+              <w:rFonts w:asciiTheme="minorHAnsi" w:eastAsiaTheme="minorEastAsia" w:hAnsiTheme="minorHAnsi" w:cstheme="minorBidi"/>
+              <w:noProof/>
+              <w:kern w:val="2"/>
+              <w:sz w:val="24"/>
+              <w:szCs w:val="24"/>
+              <w14:ligatures w14:val="standardContextual"/>
+            </w:rPr>
+          </w:pPr>
+          <w:hyperlink w:anchor="_Toc239278371" w:history="1">
+            <w:r>
+              <w:rPr>
+                <w:rStyle w:val="Hipervnculo"/>
+                <w:b/>
+                <w:bCs/>
+                <w:noProof/>
+              </w:rPr>
+              <w:t>7.2. Sprint 1 – Gestión de estaciones y registro turístico</w:t>
+            </w:r>
+            <w:r>
+              <w:rPr>
+                <w:noProof/>
+                <w:webHidden/>
+              </w:rPr>
+              <w:tab/>
+            </w:r>
+            <w:r>
+              <w:rPr>
+                <w:noProof/>
+                <w:webHidden/>
+              </w:rPr>
+              <w:fldChar w:fldCharType="begin"/>
+            </w:r>
+            <w:r>
+              <w:rPr>
+                <w:noProof/>
+                <w:webHidden/>
+              </w:rPr>
+              <w:instrText xml:space="preserve"> PAGEREF _Toc239278371 \h </w:instrText>
+            </w:r>
+            <w:r>
+              <w:rPr>
+                <w:noProof/>
+                <w:webHidden/>
+              </w:rPr>
+            </w:r>
+            <w:r>
+              <w:rPr>
+                <w:noProof/>
+                <w:webHidden/>
+              </w:rPr>
+              <w:fldChar w:fldCharType="separate"/>
+            </w:r>
+            <w:r>
+              <w:rPr>
+                <w:noProof/>
+                <w:webHidden/>
+              </w:rPr>
+              <w:t>31</w:t>
+            </w:r>
+            <w:r>
+              <w:rPr>
+                <w:noProof/>
+                <w:webHidden/>
+              </w:rPr>
+              <w:fldChar w:fldCharType="end"/>
+            </w:r>
+          </w:hyperlink>
+        </w:p>
+        <w:p>
+          <w:pPr>
+            <w:pStyle w:val="TDC2"/>
+            <w:tabs>
+              <w:tab w:val="right" w:leader="dot" w:pos="8494"/>
+            </w:tabs>
+            <w:rPr>
+              <w:rFonts w:asciiTheme="minorHAnsi" w:eastAsiaTheme="minorEastAsia" w:hAnsiTheme="minorHAnsi" w:cstheme="minorBidi"/>
+              <w:noProof/>
+              <w:kern w:val="2"/>
+              <w:sz w:val="24"/>
+              <w:szCs w:val="24"/>
+              <w14:ligatures w14:val="standardContextual"/>
+            </w:rPr>
+          </w:pPr>
+          <w:hyperlink w:anchor="_Toc239278372" w:history="1">
+            <w:r>
+              <w:rPr>
+                <w:rStyle w:val="Hipervnculo"/>
+                <w:b/>
+                <w:bCs/>
+                <w:noProof/>
+              </w:rPr>
+              <w:t>7.3. Sprint 2 – Motor de rutas peatonales y clima</w:t>
+            </w:r>
+            <w:r>
+              <w:rPr>
+                <w:noProof/>
+                <w:webHidden/>
+              </w:rPr>
+              <w:tab/>
+            </w:r>
+            <w:r>
+              <w:rPr>
+                <w:noProof/>
+                <w:webHidden/>
+              </w:rPr>
+              <w:fldChar w:fldCharType="begin"/>
+            </w:r>
+            <w:r>
+              <w:rPr>
+                <w:noProof/>
+                <w:webHidden/>
+              </w:rPr>
+              <w:instrText xml:space="preserve"> PAGEREF _Toc239278372 \h </w:instrText>
+            </w:r>
+            <w:r>
+              <w:rPr>
+                <w:noProof/>
+                <w:webHidden/>
+              </w:rPr>
+            </w:r>
+            <w:r>
+              <w:rPr>
+                <w:noProof/>
+                <w:webHidden/>
+              </w:rPr>
+              <w:fldChar w:fldCharType="separate"/>
+            </w:r>
+            <w:r>
+              <w:rPr>
+                <w:noProof/>
+                <w:webHidden/>
+              </w:rPr>
+              <w:t>31</w:t>
+            </w:r>
+            <w:r>
+              <w:rPr>
+                <w:noProof/>
+                <w:webHidden/>
+              </w:rPr>
+              <w:fldChar w:fldCharType="end"/>
+            </w:r>
+          </w:hyperlink>
+        </w:p>
+        <w:p>
+          <w:pPr>
+            <w:pStyle w:val="TDC2"/>
+            <w:tabs>
+              <w:tab w:val="right" w:leader="dot" w:pos="8494"/>
+            </w:tabs>
+            <w:rPr>
+              <w:rFonts w:asciiTheme="minorHAnsi" w:eastAsiaTheme="minorEastAsia" w:hAnsiTheme="minorHAnsi" w:cstheme="minorBidi"/>
+              <w:noProof/>
+              <w:kern w:val="2"/>
+              <w:sz w:val="24"/>
+              <w:szCs w:val="24"/>
+              <w14:ligatures w14:val="standardContextual"/>
+            </w:rPr>
+          </w:pPr>
+          <w:hyperlink w:anchor="_Toc239278373" w:history="1">
+            <w:r>
+              <w:rPr>
+                <w:rStyle w:val="Hipervnculo"/>
+                <w:b/>
+                <w:bCs/>
+                <w:noProof/>
+              </w:rPr>
+              <w:t>7.4. Sprint 3 – Spring</w:t>
+            </w:r>
+            <w:r>
+              <w:rPr>
+                <w:noProof/>
+                <w:webHidden/>
+              </w:rPr>
+              <w:tab/>
+            </w:r>
+            <w:r>
+              <w:rPr>
+                <w:noProof/>
+                <w:webHidden/>
+              </w:rPr>
+              <w:fldChar w:fldCharType="begin"/>
+            </w:r>
+            <w:r>
+              <w:rPr>
+                <w:noProof/>
+                <w:webHidden/>
+              </w:rPr>
+              <w:instrText xml:space="preserve"> PAGEREF _Toc239278373 \h </w:instrText>
+            </w:r>
+            <w:r>
+              <w:rPr>
+                <w:noProof/>
+                <w:webHidden/>
+              </w:rPr>
+            </w:r>
+            <w:r>
+              <w:rPr>
+                <w:noProof/>
+                <w:webHidden/>
+              </w:rPr>
+              <w:fldChar w:fldCharType="separate"/>
+            </w:r>
+            <w:r>
+              <w:rPr>
+                <w:noProof/>
+                <w:webHidden/>
+              </w:rPr>
+              <w:t>32</w:t>
+            </w:r>
+            <w:r>
+              <w:rPr>
+                <w:noProof/>
+                <w:webHidden/>
+              </w:rPr>
+              <w:fldChar w:fldCharType="end"/>
+            </w:r>
+          </w:hyperlink>
+        </w:p>
+        <w:p>
+          <w:pPr>
+            <w:pStyle w:val="TDC2"/>
+            <w:tabs>
+              <w:tab w:val="right" w:leader="dot" w:pos="8494"/>
+            </w:tabs>
+            <w:rPr>
+              <w:rFonts w:asciiTheme="minorHAnsi" w:eastAsiaTheme="minorEastAsia" w:hAnsiTheme="minorHAnsi" w:cstheme="minorBidi"/>
+              <w:noProof/>
+              <w:kern w:val="2"/>
+              <w:sz w:val="24"/>
+              <w:szCs w:val="24"/>
+              <w14:ligatures w14:val="standardContextual"/>
+            </w:rPr>
+          </w:pPr>
+          <w:hyperlink w:anchor="_Toc239278374" w:history="1">
+            <w:r>
+              <w:rPr>
+                <w:rStyle w:val="Hipervnculo"/>
+                <w:b/>
+                <w:bCs/>
+                <w:noProof/>
+              </w:rPr>
+              <w:t>7.5. Sprint 4 – Informes consolidados, optimización y entrega</w:t>
+            </w:r>
+            <w:r>
+              <w:rPr>
+                <w:noProof/>
+                <w:webHidden/>
+              </w:rPr>
+              <w:tab/>
+            </w:r>
+            <w:r>
+              <w:rPr>
+                <w:noProof/>
+                <w:webHidden/>
+              </w:rPr>
+              <w:fldChar w:fldCharType="begin"/>
+            </w:r>
+            <w:r>
+              <w:rPr>
+                <w:noProof/>
+                <w:webHidden/>
+              </w:rPr>
+              <w:instrText xml:space="preserve"> PAGEREF _Toc239278374 \h </w:instrText>
+            </w:r>
+            <w:r>
+              <w:rPr>
+                <w:noProof/>
+                <w:webHidden/>
+              </w:rPr>
+            </w:r>
+            <w:r>
+              <w:rPr>
+                <w:noProof/>
+                <w:webHidden/>
+              </w:rPr>
+              <w:fldChar w:fldCharType="separate"/>
+            </w:r>
+            <w:r>
+              <w:rPr>
+                <w:noProof/>
+                <w:webHidden/>
+              </w:rPr>
+              <w:t>32</w:t>
+            </w:r>
+            <w:r>
+              <w:rPr>
+                <w:noProof/>
+                <w:webHidden/>
+              </w:rPr>
+              <w:fldChar w:fldCharType="end"/>
+            </w:r>
+          </w:hyperlink>
+        </w:p>
+        <w:p>
+          <w:pPr>
+            <w:pStyle w:val="TDC1"/>
+            <w:tabs>
+              <w:tab w:val="right" w:leader="dot" w:pos="8494"/>
+            </w:tabs>
+            <w:rPr>
+              <w:rFonts w:asciiTheme="minorHAnsi" w:eastAsiaTheme="minorEastAsia" w:hAnsiTheme="minorHAnsi" w:cstheme="minorBidi"/>
+              <w:noProof/>
+              <w:kern w:val="2"/>
+              <w:sz w:val="24"/>
+              <w:szCs w:val="24"/>
+              <w14:ligatures w14:val="standardContextual"/>
+            </w:rPr>
+          </w:pPr>
+          <w:hyperlink w:anchor="_Toc239278375" w:history="1">
+            <w:r>
+              <w:rPr>
+                <w:rStyle w:val="Hipervnculo"/>
+                <w:b/>
+                <w:bCs/>
+                <w:noProof/>
+              </w:rPr>
+              <w:t>8. Plan de pruebas y calidad</w:t>
+            </w:r>
+            <w:r>
+              <w:rPr>
+                <w:noProof/>
+                <w:webHidden/>
+              </w:rPr>
+              <w:tab/>
+            </w:r>
+            <w:r>
+              <w:rPr>
+                <w:noProof/>
+                <w:webHidden/>
+              </w:rPr>
+              <w:fldChar w:fldCharType="begin"/>
+            </w:r>
+            <w:r>
+              <w:rPr>
+                <w:noProof/>
+                <w:webHidden/>
+              </w:rPr>
+              <w:instrText xml:space="preserve"> PAGEREF _Toc239278375 \h </w:instrText>
+            </w:r>
+            <w:r>
+              <w:rPr>
+                <w:noProof/>
+                <w:webHidden/>
+              </w:rPr>
+            </w:r>
+            <w:r>
+              <w:rPr>
+                <w:noProof/>
+                <w:webHidden/>
+              </w:rPr>
+              <w:fldChar w:fldCharType="separate"/>
+            </w:r>
+            <w:r>
+              <w:rPr>
+                <w:noProof/>
+                <w:webHidden/>
+              </w:rPr>
+              <w:t>33</w:t>
+            </w:r>
+            <w:r>
+              <w:rPr>
+                <w:noProof/>
+                <w:webHidden/>
+              </w:rPr>
+              <w:fldChar w:fldCharType="end"/>
+            </w:r>
+          </w:hyperlink>
+        </w:p>
+        <w:p>
+          <w:pPr>
+            <w:pStyle w:val="TDC2"/>
+            <w:tabs>
+              <w:tab w:val="right" w:leader="dot" w:pos="8494"/>
+            </w:tabs>
+            <w:rPr>
+              <w:rFonts w:asciiTheme="minorHAnsi" w:eastAsiaTheme="minorEastAsia" w:hAnsiTheme="minorHAnsi" w:cstheme="minorBidi"/>
+              <w:noProof/>
+              <w:kern w:val="2"/>
+              <w:sz w:val="24"/>
+              <w:szCs w:val="24"/>
+              <w14:ligatures w14:val="standardContextual"/>
+            </w:rPr>
+          </w:pPr>
+          <w:hyperlink w:anchor="_Toc239278376" w:history="1">
+            <w:r>
+              <w:rPr>
+                <w:rStyle w:val="Hipervnculo"/>
+                <w:b/>
+                <w:bCs/>
+                <w:noProof/>
+              </w:rPr>
+              <w:t>8.1. Planificación de pruebas</w:t>
+            </w:r>
+            <w:r>
+              <w:rPr>
+                <w:noProof/>
+                <w:webHidden/>
+              </w:rPr>
+              <w:tab/>
+            </w:r>
+            <w:r>
+              <w:rPr>
+                <w:noProof/>
+                <w:webHidden/>
+              </w:rPr>
+              <w:fldChar w:fldCharType="begin"/>
+            </w:r>
+            <w:r>
+              <w:rPr>
+                <w:noProof/>
+                <w:webHidden/>
+              </w:rPr>
+              <w:instrText xml:space="preserve"> PAGEREF _Toc239278376 \h </w:instrText>
+            </w:r>
+            <w:r>
+              <w:rPr>
+                <w:noProof/>
+                <w:webHidden/>
+              </w:rPr>
+            </w:r>
+            <w:r>
+              <w:rPr>
+                <w:noProof/>
+                <w:webHidden/>
+              </w:rPr>
+              <w:fldChar w:fldCharType="separate"/>
+            </w:r>
+            <w:r>
+              <w:rPr>
+                <w:noProof/>
+                <w:webHidden/>
+              </w:rPr>
+              <w:t>33</w:t>
+            </w:r>
+            <w:r>
+              <w:rPr>
+                <w:noProof/>
+                <w:webHidden/>
+              </w:rPr>
+              <w:fldChar w:fldCharType="end"/>
+            </w:r>
+          </w:hyperlink>
+        </w:p>
+        <w:p>
+          <w:pPr>
+            <w:pStyle w:val="TDC2"/>
+            <w:tabs>
+              <w:tab w:val="right" w:leader="dot" w:pos="8494"/>
+            </w:tabs>
+            <w:rPr>
+              <w:rFonts w:asciiTheme="minorHAnsi" w:eastAsiaTheme="minorEastAsia" w:hAnsiTheme="minorHAnsi" w:cstheme="minorBidi"/>
+              <w:noProof/>
+              <w:kern w:val="2"/>
+              <w:sz w:val="24"/>
+              <w:szCs w:val="24"/>
+              <w14:ligatures w14:val="standardContextual"/>
+            </w:rPr>
+          </w:pPr>
+          <w:hyperlink w:anchor="_Toc239278377" w:history="1">
+            <w:r>
+              <w:rPr>
+                <w:rStyle w:val="Hipervnculo"/>
+                <w:b/>
+                <w:bCs/>
+                <w:noProof/>
+              </w:rPr>
+              <w:t>8.</w:t>
+            </w:r>
+            <w:r>
+              <w:rPr>
+                <w:rStyle w:val="Hipervnculo"/>
+                <w:b/>
+                <w:bCs/>
+                <w:noProof/>
+                <w:lang w:val="es-ES"/>
+              </w:rPr>
+              <w:t>2. Pruebas funcionales</w:t>
+            </w:r>
+            <w:r>
+              <w:rPr>
+                <w:noProof/>
+                <w:webHidden/>
+              </w:rPr>
+              <w:tab/>
+            </w:r>
+            <w:r>
+              <w:rPr>
+                <w:noProof/>
+                <w:webHidden/>
+              </w:rPr>
+              <w:fldChar w:fldCharType="begin"/>
+            </w:r>
+            <w:r>
+              <w:rPr>
+                <w:noProof/>
+                <w:webHidden/>
+              </w:rPr>
+              <w:instrText xml:space="preserve"> PAGEREF _Toc239278377 \h </w:instrText>
+            </w:r>
+            <w:r>
+              <w:rPr>
+                <w:noProof/>
+                <w:webHidden/>
+              </w:rPr>
+            </w:r>
+            <w:r>
+              <w:rPr>
+                <w:noProof/>
+                <w:webHidden/>
+              </w:rPr>
+              <w:fldChar w:fldCharType="separate"/>
+            </w:r>
+            <w:r>
+              <w:rPr>
+                <w:noProof/>
+                <w:webHidden/>
+              </w:rPr>
+              <w:t>33</w:t>
+            </w:r>
+            <w:r>
+              <w:rPr>
+                <w:noProof/>
+                <w:webHidden/>
+              </w:rPr>
+              <w:fldChar w:fldCharType="end"/>
+            </w:r>
+          </w:hyperlink>
+        </w:p>
+        <w:p>
+          <w:pPr>
+            <w:pStyle w:val="TDC3"/>
+            <w:tabs>
+              <w:tab w:val="right" w:leader="dot" w:pos="8494"/>
+            </w:tabs>
+            <w:rPr>
+              <w:rFonts w:asciiTheme="minorHAnsi" w:eastAsiaTheme="minorEastAsia" w:hAnsiTheme="minorHAnsi" w:cstheme="minorBidi"/>
+              <w:noProof/>
+              <w:kern w:val="2"/>
+              <w:sz w:val="24"/>
+              <w:szCs w:val="24"/>
+              <w14:ligatures w14:val="standardContextual"/>
+            </w:rPr>
+          </w:pPr>
+          <w:hyperlink w:anchor="_Toc239278378" w:history="1">
+            <w:r>
+              <w:rPr>
+                <w:rStyle w:val="Hipervnculo"/>
+                <w:b/>
+                <w:bCs/>
+                <w:noProof/>
+              </w:rPr>
+              <w:t>8.2.1. Pruebas de caja blanca</w:t>
+            </w:r>
+            <w:r>
+              <w:rPr>
+                <w:noProof/>
+                <w:webHidden/>
+              </w:rPr>
+              <w:tab/>
+            </w:r>
+            <w:r>
+              <w:rPr>
+                <w:noProof/>
+                <w:webHidden/>
+              </w:rPr>
+              <w:fldChar w:fldCharType="begin"/>
+            </w:r>
+            <w:r>
+              <w:rPr>
+                <w:noProof/>
+                <w:webHidden/>
+              </w:rPr>
+              <w:instrText xml:space="preserve"> PAGEREF _Toc239278378 \h </w:instrText>
+            </w:r>
+            <w:r>
+              <w:rPr>
+                <w:noProof/>
+                <w:webHidden/>
+              </w:rPr>
+            </w:r>
+            <w:r>
+              <w:rPr>
+                <w:noProof/>
+                <w:webHidden/>
+              </w:rPr>
+              <w:fldChar w:fldCharType="separate"/>
+            </w:r>
+            <w:r>
+              <w:rPr>
+                <w:noProof/>
+                <w:webHidden/>
+              </w:rPr>
+              <w:t>33</w:t>
+            </w:r>
+            <w:r>
+              <w:rPr>
+                <w:noProof/>
+                <w:webHidden/>
+              </w:rPr>
+              <w:fldChar w:fldCharType="end"/>
+            </w:r>
+          </w:hyperlink>
+        </w:p>
+        <w:p>
+          <w:pPr>
+            <w:pStyle w:val="TDC3"/>
+            <w:tabs>
+              <w:tab w:val="right" w:leader="dot" w:pos="8494"/>
+            </w:tabs>
+            <w:rPr>
+              <w:rFonts w:asciiTheme="minorHAnsi" w:eastAsiaTheme="minorEastAsia" w:hAnsiTheme="minorHAnsi" w:cstheme="minorBidi"/>
+              <w:noProof/>
+              <w:kern w:val="2"/>
+              <w:sz w:val="24"/>
+              <w:szCs w:val="24"/>
+              <w14:ligatures w14:val="standardContextual"/>
+            </w:rPr>
+          </w:pPr>
+          <w:hyperlink w:anchor="_Toc239278379" w:history="1">
+            <w:r>
+              <w:rPr>
+                <w:rStyle w:val="Hipervnculo"/>
+                <w:b/>
+                <w:bCs/>
+                <w:noProof/>
+              </w:rPr>
+              <w:t>8.2.2. Pruebas de caja negra</w:t>
+            </w:r>
+            <w:r>
+              <w:rPr>
+                <w:noProof/>
+                <w:webHidden/>
+              </w:rPr>
+              <w:tab/>
+            </w:r>
+            <w:r>
+              <w:rPr>
+                <w:noProof/>
+                <w:webHidden/>
+              </w:rPr>
+              <w:fldChar w:fldCharType="begin"/>
+            </w:r>
+            <w:r>
+              <w:rPr>
+                <w:noProof/>
+                <w:webHidden/>
+              </w:rPr>
+              <w:instrText xml:space="preserve"> PAGEREF _Toc239278379 \h </w:instrText>
+            </w:r>
+            <w:r>
+              <w:rPr>
+                <w:noProof/>
+                <w:webHidden/>
+              </w:rPr>
+            </w:r>
+            <w:r>
+              <w:rPr>
+                <w:noProof/>
+                <w:webHidden/>
+              </w:rPr>
+              <w:fldChar w:fldCharType="separate"/>
+            </w:r>
+            <w:r>
+              <w:rPr>
+                <w:noProof/>
+                <w:webHidden/>
+              </w:rPr>
+              <w:t>35</w:t>
             </w:r>
             <w:r>
               <w:rPr>
@@ -2056,7 +3577,7 @@
           <w:szCs w:val="28"/>
         </w:rPr>
       </w:pPr>
-      <w:bookmarkStart w:id="0" w:name="_Toc239067881"/>
+      <w:bookmarkStart w:id="0" w:name="_Toc239278344"/>
       <w:r>
         <w:rPr>
           <w:rFonts w:ascii="Calibri" w:hAnsi="Calibri" w:cs="Calibri"/>
@@ -2067,40 +3588,81 @@
           <w:szCs w:val="28"/>
         </w:rPr>
         <w:lastRenderedPageBreak/>
-        <w:t>1. Planteamiento de la problemática</w:t>
+        <w:t xml:space="preserve">1. </w:t>
+      </w:r>
+      <w:r>
+        <w:rPr>
+          <w:rFonts w:ascii="Calibri" w:hAnsi="Calibri" w:cs="Calibri"/>
+          <w:b/>
+          <w:bCs/>
+          <w:color w:val="auto"/>
+          <w:sz w:val="28"/>
+          <w:szCs w:val="28"/>
+        </w:rPr>
+        <w:t>Perfil del proyecto</w:t>
       </w:r>
       <w:bookmarkEnd w:id="0"/>
     </w:p>
     <w:p>
-      <w:r>
-        <w:t xml:space="preserve">El ministerio de transporte </w:t>
-      </w:r>
-      <w:r>
-        <w:t>y comunicaciones (MTC) ha identificado que los turistas que utilizan el servicio ferroviario para acceder a zonas turísticas no cuentan con una herramienta que integre, de manera automatizada, la información climática (SENAMHI), los datos logísticos del servicio de trenes (</w:t>
-      </w:r>
-      <w:proofErr w:type="spellStart"/>
-      <w:r>
-        <w:t>PeruRail</w:t>
-      </w:r>
-      <w:proofErr w:type="spellEnd"/>
-      <w:r>
-        <w:t>)</w:t>
-      </w:r>
-      <w:r>
-        <w:t xml:space="preserve"> y</w:t>
-      </w:r>
-      <w:r>
-        <w:t xml:space="preserve"> </w:t>
-      </w:r>
-      <w:r>
-        <w:t xml:space="preserve">el registro de zonas turísticas caminables </w:t>
-      </w:r>
-      <w:r>
-        <w:t>(Travel Group Perú). Esta dispersión de la información dificulta la planificación de visitas a pie desde las estaciones ferroviarias, incrementando la incertidumbre del turista frente al clima, los tiempos de tránsito, las tarifas y las distancias de las rutas peatonales disponibles.</w:t>
-      </w:r>
+      <w:pPr>
+        <w:pStyle w:val="Ttulo2"/>
+        <w:rPr>
+          <w:rFonts w:ascii="Calibri" w:hAnsi="Calibri" w:cs="Calibri"/>
+          <w:b/>
+          <w:bCs/>
+        </w:rPr>
+      </w:pPr>
+      <w:r>
+        <w:tab/>
+      </w:r>
+      <w:bookmarkStart w:id="1" w:name="_Toc239278345"/>
+      <w:r>
+        <w:rPr>
+          <w:rFonts w:ascii="Calibri" w:hAnsi="Calibri" w:cs="Calibri"/>
+          <w:b/>
+          <w:bCs/>
+          <w:color w:val="auto"/>
+          <w:sz w:val="24"/>
+          <w:szCs w:val="24"/>
+        </w:rPr>
+        <w:t>1.1. Planteamiento de la problemática</w:t>
+      </w:r>
+      <w:bookmarkEnd w:id="1"/>
     </w:p>
     <w:p>
       <w:pPr>
+        <w:ind w:left="708"/>
+      </w:pPr>
+      <w:r>
+        <w:t xml:space="preserve">El ministerio de transporte </w:t>
+      </w:r>
+      <w:r>
+        <w:t>y comunicaciones (MTC) ha identificado que los turistas que utilizan el servicio ferroviario para acceder a zonas turísticas no cuentan con una herramienta que integre, de manera automatizada, la información climática (SENAMHI), los datos logísticos del servicio de trenes (</w:t>
+      </w:r>
+      <w:proofErr w:type="spellStart"/>
+      <w:r>
+        <w:t>PeruRail</w:t>
+      </w:r>
+      <w:proofErr w:type="spellEnd"/>
+      <w:r>
+        <w:t>)</w:t>
+      </w:r>
+      <w:r>
+        <w:t xml:space="preserve"> y</w:t>
+      </w:r>
+      <w:r>
+        <w:t xml:space="preserve"> </w:t>
+      </w:r>
+      <w:r>
+        <w:t xml:space="preserve">el registro de zonas turísticas caminables </w:t>
+      </w:r>
+      <w:r>
+        <w:t>(Travel Group Perú). Esta dispersión de la información dificulta la planificación de visitas a pie desde las estaciones ferroviarias, incrementando la incertidumbre del turista frente al clima, los tiempos de tránsito, las tarifas y las distancias de las rutas peatonales disponibles.</w:t>
+      </w:r>
+    </w:p>
+    <w:p>
+      <w:pPr>
+        <w:ind w:left="708"/>
         <w:rPr>
           <w:lang w:val="es-ES"/>
         </w:rPr>
@@ -2117,6 +3679,443 @@
         </w:rPr>
         <w:t>para realizarse exclusivamente a pie, bajo un modelo de trayecto único de ida y vuelta a la misma estación de origen, en función de las preferencias personales que el turista defina (naturaleza, historia, aventura, etc.).</w:t>
       </w:r>
+    </w:p>
+    <w:p>
+      <w:pPr>
+        <w:pStyle w:val="Ttulo2"/>
+        <w:ind w:firstLine="708"/>
+        <w:rPr>
+          <w:rFonts w:ascii="Calibri" w:hAnsi="Calibri" w:cs="Calibri"/>
+          <w:b/>
+          <w:bCs/>
+          <w:color w:val="auto"/>
+          <w:sz w:val="24"/>
+          <w:szCs w:val="24"/>
+          <w:lang w:val="es-ES"/>
+        </w:rPr>
+      </w:pPr>
+      <w:bookmarkStart w:id="2" w:name="_Toc239278346"/>
+      <w:r>
+        <w:rPr>
+          <w:rFonts w:ascii="Calibri" w:hAnsi="Calibri" w:cs="Calibri"/>
+          <w:b/>
+          <w:bCs/>
+          <w:color w:val="auto"/>
+          <w:sz w:val="24"/>
+          <w:szCs w:val="24"/>
+          <w:lang w:val="es-ES"/>
+        </w:rPr>
+        <w:t>1.2. Propósito y justificación</w:t>
+      </w:r>
+      <w:bookmarkEnd w:id="2"/>
+    </w:p>
+    <w:p>
+      <w:pPr>
+        <w:ind w:left="708"/>
+      </w:pPr>
+      <w:r>
+        <w:t xml:space="preserve">El MTC busca fomentar el uso del transporte público ferroviario y dinamizar el turismo local, ofreciendo a los pasajeros de </w:t>
+      </w:r>
+      <w:proofErr w:type="spellStart"/>
+      <w:r>
+        <w:t>PeruRail</w:t>
+      </w:r>
+      <w:proofErr w:type="spellEnd"/>
+      <w:r>
+        <w:t xml:space="preserve"> una herramienta que les permita conocer, desde la estación en la que se encuentren, las zonas turísticas accesibles a pie, con información climática y logística actualizada, de modo que puedan planificar una visita de ida y vuelta en un solo tramo el mismo día.</w:t>
+      </w:r>
+    </w:p>
+    <w:p>
+      <w:pPr>
+        <w:pStyle w:val="Ttulo2"/>
+        <w:ind w:firstLine="708"/>
+        <w:rPr>
+          <w:rFonts w:ascii="Calibri" w:hAnsi="Calibri" w:cs="Calibri"/>
+          <w:b/>
+          <w:bCs/>
+          <w:color w:val="auto"/>
+          <w:sz w:val="24"/>
+          <w:szCs w:val="24"/>
+        </w:rPr>
+      </w:pPr>
+      <w:bookmarkStart w:id="3" w:name="_Toc239278347"/>
+      <w:r>
+        <w:rPr>
+          <w:rFonts w:ascii="Calibri" w:hAnsi="Calibri" w:cs="Calibri"/>
+          <w:b/>
+          <w:bCs/>
+          <w:color w:val="auto"/>
+          <w:sz w:val="24"/>
+          <w:szCs w:val="24"/>
+        </w:rPr>
+        <w:t xml:space="preserve">1.3. </w:t>
+      </w:r>
+      <w:r>
+        <w:rPr>
+          <w:rFonts w:ascii="Calibri" w:hAnsi="Calibri" w:cs="Calibri"/>
+          <w:b/>
+          <w:bCs/>
+          <w:color w:val="auto"/>
+          <w:sz w:val="24"/>
+          <w:szCs w:val="24"/>
+        </w:rPr>
+        <w:t>Objetivos del Proyecto</w:t>
+      </w:r>
+      <w:bookmarkEnd w:id="3"/>
+    </w:p>
+    <w:p>
+      <w:pPr>
+        <w:rPr>
+          <w:b/>
+          <w:bCs/>
+        </w:rPr>
+      </w:pPr>
+      <w:r>
+        <w:tab/>
+      </w:r>
+      <w:r>
+        <w:rPr>
+          <w:b/>
+          <w:bCs/>
+        </w:rPr>
+        <w:t>Objetivo General</w:t>
+      </w:r>
+    </w:p>
+    <w:p>
+      <w:pPr>
+        <w:ind w:left="708"/>
+      </w:pPr>
+      <w:r>
+        <w:t>Desarrollar e implementar una plataforma software web que integre información climática (SENAMHI), logístico-ferroviaria (</w:t>
+      </w:r>
+      <w:proofErr w:type="spellStart"/>
+      <w:r>
+        <w:t>PeruRail</w:t>
+      </w:r>
+      <w:proofErr w:type="spellEnd"/>
+      <w:r>
+        <w:t>) y turística (Travel Group Perú) para recomendar rutas turísticas peatonales desde estaciones de tren.</w:t>
+      </w:r>
+    </w:p>
+    <w:p>
+      <w:pPr>
+        <w:ind w:left="708"/>
+        <w:rPr>
+          <w:b/>
+          <w:bCs/>
+        </w:rPr>
+      </w:pPr>
+      <w:r>
+        <w:rPr>
+          <w:b/>
+          <w:bCs/>
+        </w:rPr>
+        <w:t>Objetivos Específicos</w:t>
+      </w:r>
+    </w:p>
+    <w:p>
+      <w:pPr>
+        <w:pStyle w:val="Prrafodelista"/>
+        <w:numPr>
+          <w:ilvl w:val="0"/>
+          <w:numId w:val="29"/>
+        </w:numPr>
+        <w:spacing w:after="80" w:line="240" w:lineRule="auto"/>
+        <w:contextualSpacing w:val="0"/>
+      </w:pPr>
+      <w:r>
+        <w:t>Integrar de forma periódica y automatizada los datos de las tres fuentes externas.</w:t>
+      </w:r>
+    </w:p>
+    <w:p>
+      <w:pPr>
+        <w:pStyle w:val="Prrafodelista"/>
+        <w:numPr>
+          <w:ilvl w:val="0"/>
+          <w:numId w:val="29"/>
+        </w:numPr>
+        <w:spacing w:after="80" w:line="240" w:lineRule="auto"/>
+        <w:contextualSpacing w:val="0"/>
+      </w:pPr>
+      <w:r>
+        <w:t>Permitir al usuario registrar preferencias personales de tipo de turismo.</w:t>
+      </w:r>
+    </w:p>
+    <w:p>
+      <w:pPr>
+        <w:pStyle w:val="Prrafodelista"/>
+        <w:numPr>
+          <w:ilvl w:val="0"/>
+          <w:numId w:val="29"/>
+        </w:numPr>
+        <w:spacing w:after="80" w:line="240" w:lineRule="auto"/>
+        <w:contextualSpacing w:val="0"/>
+      </w:pPr>
+      <w:r>
+        <w:t>Generar un informe consolidado y visualizable con clima, ruta, tiempo y tarifa.</w:t>
+      </w:r>
+    </w:p>
+    <w:p>
+      <w:pPr>
+        <w:pStyle w:val="Prrafodelista"/>
+        <w:numPr>
+          <w:ilvl w:val="0"/>
+          <w:numId w:val="29"/>
+        </w:numPr>
+        <w:spacing w:after="80" w:line="240" w:lineRule="auto"/>
+        <w:contextualSpacing w:val="0"/>
+      </w:pPr>
+      <w:r>
+        <w:t>Brindar a Travel Group Perú un panel para el mantenimiento de zonas turísticas.</w:t>
+      </w:r>
+    </w:p>
+    <w:p>
+      <w:pPr>
+        <w:pStyle w:val="Prrafodelista"/>
+        <w:numPr>
+          <w:ilvl w:val="0"/>
+          <w:numId w:val="29"/>
+        </w:numPr>
+        <w:spacing w:after="80" w:line="240" w:lineRule="auto"/>
+        <w:contextualSpacing w:val="0"/>
+      </w:pPr>
+      <w:r>
+        <w:t>Garantizar tiempos de respuesta menores a 2 segundos y una interfaz responsive.</w:t>
+      </w:r>
+    </w:p>
+    <w:p>
+      <w:pPr>
+        <w:pStyle w:val="Ttulo2"/>
+        <w:ind w:firstLine="708"/>
+        <w:rPr>
+          <w:rFonts w:ascii="Calibri" w:hAnsi="Calibri" w:cs="Calibri"/>
+          <w:b/>
+          <w:bCs/>
+          <w:color w:val="auto"/>
+          <w:sz w:val="24"/>
+          <w:szCs w:val="24"/>
+        </w:rPr>
+      </w:pPr>
+      <w:bookmarkStart w:id="4" w:name="_Toc239278348"/>
+      <w:r>
+        <w:rPr>
+          <w:rFonts w:ascii="Calibri" w:hAnsi="Calibri" w:cs="Calibri"/>
+          <w:b/>
+          <w:bCs/>
+          <w:color w:val="auto"/>
+          <w:sz w:val="24"/>
+          <w:szCs w:val="24"/>
+        </w:rPr>
+        <w:t xml:space="preserve">1.4. </w:t>
+      </w:r>
+      <w:r>
+        <w:rPr>
+          <w:rFonts w:ascii="Calibri" w:hAnsi="Calibri" w:cs="Calibri"/>
+          <w:b/>
+          <w:bCs/>
+          <w:color w:val="auto"/>
+          <w:sz w:val="24"/>
+          <w:szCs w:val="24"/>
+        </w:rPr>
+        <w:t>Alcance del Proyecto</w:t>
+      </w:r>
+      <w:bookmarkEnd w:id="4"/>
+    </w:p>
+    <w:p>
+      <w:pPr>
+        <w:ind w:left="708"/>
+      </w:pPr>
+      <w:r>
+        <w:rPr>
+          <w:b/>
+          <w:bCs/>
+        </w:rPr>
+        <w:t xml:space="preserve">Incluye: </w:t>
+      </w:r>
+      <w:r>
+        <w:t>M</w:t>
+      </w:r>
+      <w:r>
+        <w:t>ódulo de integración de datos, módulo de administración (CRUD de zonas, estaciones en solo lectura, horarios y precios), módulo de cliente final (preferencias, visualización, informe) y módulo de informes.</w:t>
+      </w:r>
+    </w:p>
+    <w:p>
+      <w:pPr>
+        <w:ind w:left="708"/>
+      </w:pPr>
+      <w:r>
+        <w:rPr>
+          <w:b/>
+          <w:bCs/>
+        </w:rPr>
+        <w:lastRenderedPageBreak/>
+        <w:t xml:space="preserve">No incluye: </w:t>
+      </w:r>
+      <w:r>
+        <w:t>V</w:t>
+      </w:r>
+      <w:r>
+        <w:t>enta ni reserva de pasajes (se muestra tarifa referencial), rutas en medios distintos a caminata, ni tramos con más de una escala.</w:t>
+      </w:r>
+    </w:p>
+    <w:p>
+      <w:pPr>
+        <w:pStyle w:val="Ttulo2"/>
+        <w:ind w:firstLine="708"/>
+        <w:rPr>
+          <w:rFonts w:ascii="Calibri" w:hAnsi="Calibri" w:cs="Calibri"/>
+          <w:b/>
+          <w:bCs/>
+          <w:color w:val="auto"/>
+          <w:sz w:val="24"/>
+          <w:szCs w:val="24"/>
+        </w:rPr>
+      </w:pPr>
+      <w:bookmarkStart w:id="5" w:name="_Toc239278349"/>
+      <w:r>
+        <w:rPr>
+          <w:rFonts w:ascii="Calibri" w:hAnsi="Calibri" w:cs="Calibri"/>
+          <w:b/>
+          <w:bCs/>
+          <w:color w:val="auto"/>
+          <w:sz w:val="24"/>
+          <w:szCs w:val="24"/>
+        </w:rPr>
+        <w:t xml:space="preserve">1.5. </w:t>
+      </w:r>
+      <w:r>
+        <w:rPr>
+          <w:rFonts w:ascii="Calibri" w:hAnsi="Calibri" w:cs="Calibri"/>
+          <w:b/>
+          <w:bCs/>
+          <w:color w:val="auto"/>
+          <w:sz w:val="24"/>
+          <w:szCs w:val="24"/>
+        </w:rPr>
+        <w:t>Supuestos y Restricciones</w:t>
+      </w:r>
+      <w:bookmarkEnd w:id="5"/>
+    </w:p>
+    <w:p>
+      <w:pPr>
+        <w:rPr>
+          <w:b/>
+          <w:bCs/>
+        </w:rPr>
+      </w:pPr>
+      <w:r>
+        <w:tab/>
+      </w:r>
+      <w:r>
+        <w:rPr>
+          <w:b/>
+          <w:bCs/>
+        </w:rPr>
+        <w:t>Supuestos</w:t>
+      </w:r>
+    </w:p>
+    <w:p>
+      <w:pPr>
+        <w:numPr>
+          <w:ilvl w:val="0"/>
+          <w:numId w:val="30"/>
+        </w:numPr>
+      </w:pPr>
+      <w:r>
+        <w:t xml:space="preserve">SENAMHI y </w:t>
+      </w:r>
+      <w:proofErr w:type="spellStart"/>
+      <w:r>
+        <w:t>PeruRail</w:t>
+      </w:r>
+      <w:proofErr w:type="spellEnd"/>
+      <w:r>
+        <w:t xml:space="preserve"> exponen o autorizan el consumo de sus datos mediante API o archivo periódico.</w:t>
+      </w:r>
+    </w:p>
+    <w:p>
+      <w:pPr>
+        <w:numPr>
+          <w:ilvl w:val="0"/>
+          <w:numId w:val="30"/>
+        </w:numPr>
+      </w:pPr>
+      <w:r>
+        <w:t>Travel Group Perú cuenta con personal para el registro y mantenimiento de zonas turísticas.</w:t>
+      </w:r>
+    </w:p>
+    <w:p>
+      <w:pPr>
+        <w:numPr>
+          <w:ilvl w:val="0"/>
+          <w:numId w:val="30"/>
+        </w:numPr>
+      </w:pPr>
+      <w:r>
+        <w:t>Las rutas turísticas propuestas son transitables a pie en condiciones normales.</w:t>
+      </w:r>
+    </w:p>
+    <w:p>
+      <w:pPr>
+        <w:ind w:left="708"/>
+        <w:rPr>
+          <w:b/>
+          <w:bCs/>
+        </w:rPr>
+      </w:pPr>
+      <w:r>
+        <w:rPr>
+          <w:b/>
+          <w:bCs/>
+        </w:rPr>
+        <w:t>Restricciones</w:t>
+      </w:r>
+    </w:p>
+    <w:p>
+      <w:pPr>
+        <w:numPr>
+          <w:ilvl w:val="0"/>
+          <w:numId w:val="30"/>
+        </w:numPr>
+      </w:pPr>
+      <w:r>
+        <w:t>El proyecto se limita a rutas de ida y vuelta en un solo tramo (sin combinaciones).</w:t>
+      </w:r>
+    </w:p>
+    <w:p>
+      <w:pPr>
+        <w:numPr>
+          <w:ilvl w:val="0"/>
+          <w:numId w:val="30"/>
+        </w:numPr>
+      </w:pPr>
+      <w:r>
+        <w:t>El presupuesto y cronograma están sujetos a lo definido por el equipo académico.</w:t>
+      </w:r>
+    </w:p>
+    <w:p>
+      <w:pPr>
+        <w:numPr>
+          <w:ilvl w:val="0"/>
+          <w:numId w:val="30"/>
+        </w:numPr>
+      </w:pPr>
+      <w:r>
+        <w:t>La disponibilidad de datos depende de la actualización de los proveedores externos.</w:t>
+      </w:r>
+    </w:p>
+    <w:p>
+      <w:pPr>
+        <w:ind w:left="708"/>
+      </w:pPr>
+    </w:p>
+    <w:p/>
+    <w:p>
+      <w:pPr>
+        <w:rPr>
+          <w:lang w:val="es-ES"/>
+        </w:rPr>
+      </w:pPr>
     </w:p>
     <w:p>
       <w:pPr>
@@ -2145,7 +4144,7 @@
           <w:lang w:val="es-ES"/>
         </w:rPr>
       </w:pPr>
-      <w:bookmarkStart w:id="1" w:name="_Toc239067882"/>
+      <w:bookmarkStart w:id="6" w:name="_Toc239278350"/>
       <w:r>
         <w:rPr>
           <w:rFonts w:ascii="Calibri" w:hAnsi="Calibri" w:cs="Calibri"/>
@@ -2159,7 +4158,7 @@
         <w:lastRenderedPageBreak/>
         <w:t>2. Descripción general de la metodología</w:t>
       </w:r>
-      <w:bookmarkEnd w:id="1"/>
+      <w:bookmarkEnd w:id="6"/>
     </w:p>
     <w:p>
       <w:pPr>
@@ -2181,7 +4180,7 @@
         </w:rPr>
         <w:tab/>
       </w:r>
-      <w:bookmarkStart w:id="2" w:name="_Toc239067883"/>
+      <w:bookmarkStart w:id="7" w:name="_Toc239278351"/>
       <w:r>
         <w:rPr>
           <w:rFonts w:ascii="Calibri" w:hAnsi="Calibri" w:cs="Calibri"/>
@@ -2194,7 +4193,7 @@
         </w:rPr>
         <w:t>2.1. Fundamentación</w:t>
       </w:r>
-      <w:bookmarkEnd w:id="2"/>
+      <w:bookmarkEnd w:id="7"/>
     </w:p>
     <w:p>
       <w:pPr>
@@ -2822,7 +4821,7 @@
       <w:r>
         <w:tab/>
       </w:r>
-      <w:bookmarkStart w:id="3" w:name="_Toc239067884"/>
+      <w:bookmarkStart w:id="8" w:name="_Toc239278352"/>
       <w:r>
         <w:rPr>
           <w:rFonts w:ascii="Calibri" w:hAnsi="Calibri" w:cs="Calibri"/>
@@ -2834,7 +4833,7 @@
         </w:rPr>
         <w:t>2.2. Valores de trabajo</w:t>
       </w:r>
-      <w:bookmarkEnd w:id="3"/>
+      <w:bookmarkEnd w:id="8"/>
     </w:p>
     <w:p>
       <w:pPr>
@@ -2925,7 +4924,7 @@
           <w:szCs w:val="28"/>
         </w:rPr>
       </w:pPr>
-      <w:bookmarkStart w:id="4" w:name="_Toc239067885"/>
+      <w:bookmarkStart w:id="9" w:name="_Toc239278353"/>
       <w:r>
         <w:rPr>
           <w:rFonts w:ascii="Calibri" w:hAnsi="Calibri" w:cs="Calibri"/>
@@ -2938,7 +4937,7 @@
         <w:lastRenderedPageBreak/>
         <w:t>3. Personas y roles del proyecto</w:t>
       </w:r>
-      <w:bookmarkEnd w:id="4"/>
+      <w:bookmarkEnd w:id="9"/>
     </w:p>
     <w:tbl>
       <w:tblPr>
@@ -3437,7 +5436,7 @@
           <w:szCs w:val="28"/>
         </w:rPr>
       </w:pPr>
-      <w:bookmarkStart w:id="5" w:name="_Toc239067886"/>
+      <w:bookmarkStart w:id="10" w:name="_Toc239278354"/>
       <w:r>
         <w:rPr>
           <w:rFonts w:ascii="Calibri" w:hAnsi="Calibri" w:cs="Calibri"/>
@@ -3450,7 +5449,7 @@
         <w:lastRenderedPageBreak/>
         <w:t>4. Análisis</w:t>
       </w:r>
-      <w:bookmarkEnd w:id="5"/>
+      <w:bookmarkEnd w:id="10"/>
     </w:p>
     <w:p>
       <w:pPr>
@@ -3465,7 +5464,7 @@
           <w:szCs w:val="24"/>
         </w:rPr>
       </w:pPr>
-      <w:bookmarkStart w:id="6" w:name="_Toc239067887"/>
+      <w:bookmarkStart w:id="11" w:name="_Toc239278355"/>
       <w:r>
         <w:rPr>
           <w:rFonts w:ascii="Calibri" w:hAnsi="Calibri" w:cs="Calibri"/>
@@ -3477,7 +5476,7 @@
         </w:rPr>
         <w:t>4.1. Análisis de requerimientos</w:t>
       </w:r>
-      <w:bookmarkEnd w:id="6"/>
+      <w:bookmarkEnd w:id="11"/>
     </w:p>
     <w:p>
       <w:pPr>
@@ -3626,7 +5625,7 @@
           <w:szCs w:val="24"/>
         </w:rPr>
       </w:pPr>
-      <w:bookmarkStart w:id="7" w:name="_Toc239067888"/>
+      <w:bookmarkStart w:id="12" w:name="_Toc239278356"/>
       <w:r>
         <w:rPr>
           <w:rFonts w:ascii="Calibri" w:hAnsi="Calibri" w:cs="Calibri"/>
@@ -3638,7 +5637,7 @@
         </w:rPr>
         <w:t>4.2. Listado y fichas de casos de uso</w:t>
       </w:r>
-      <w:bookmarkEnd w:id="7"/>
+      <w:bookmarkEnd w:id="12"/>
     </w:p>
     <w:p>
       <w:pPr>
@@ -7406,7 +9405,7 @@
           <w:szCs w:val="24"/>
         </w:rPr>
       </w:pPr>
-      <w:bookmarkStart w:id="8" w:name="_Toc239067889"/>
+      <w:bookmarkStart w:id="13" w:name="_Toc239278357"/>
       <w:r>
         <w:rPr>
           <w:rFonts w:ascii="Calibri" w:hAnsi="Calibri" w:cs="Calibri"/>
@@ -7418,7 +9417,7 @@
         </w:rPr>
         <w:t>4.3. Requerimientos funcionales y no funcionales</w:t>
       </w:r>
-      <w:bookmarkEnd w:id="8"/>
+      <w:bookmarkEnd w:id="13"/>
     </w:p>
     <w:p>
       <w:pPr>
@@ -7444,7 +9443,7 @@
       <w:r>
         <w:tab/>
       </w:r>
-      <w:bookmarkStart w:id="9" w:name="_Toc239067890"/>
+      <w:bookmarkStart w:id="14" w:name="_Toc239278358"/>
       <w:r>
         <w:rPr>
           <w:b/>
@@ -7455,7 +9454,7 @@
         </w:rPr>
         <w:t>4.3.1. Requerimientos funcionales</w:t>
       </w:r>
-      <w:bookmarkEnd w:id="9"/>
+      <w:bookmarkEnd w:id="14"/>
     </w:p>
     <w:p>
       <w:pPr>
@@ -8080,7 +10079,7 @@
           <w:szCs w:val="22"/>
         </w:rPr>
       </w:pPr>
-      <w:bookmarkStart w:id="10" w:name="_Toc239067891"/>
+      <w:bookmarkStart w:id="15" w:name="_Toc239278359"/>
       <w:r>
         <w:rPr>
           <w:b/>
@@ -8091,7 +10090,7 @@
         </w:rPr>
         <w:t>4.3.2. Requerimientos no funcionales</w:t>
       </w:r>
-      <w:bookmarkEnd w:id="10"/>
+      <w:bookmarkEnd w:id="15"/>
     </w:p>
     <w:p>
       <w:pPr>
@@ -8312,7 +10311,7 @@
           <w:szCs w:val="24"/>
         </w:rPr>
       </w:pPr>
-      <w:bookmarkStart w:id="11" w:name="_Toc239067892"/>
+      <w:bookmarkStart w:id="16" w:name="_Toc239278360"/>
       <w:r>
         <w:rPr>
           <w:rFonts w:ascii="Calibri" w:hAnsi="Calibri" w:cs="Calibri"/>
@@ -8324,7 +10323,7 @@
         </w:rPr>
         <w:t>4.4. Historias de usuario y Sprint Backlog</w:t>
       </w:r>
-      <w:bookmarkEnd w:id="11"/>
+      <w:bookmarkEnd w:id="16"/>
     </w:p>
     <w:p>
       <w:pPr>
@@ -11569,7 +13568,6 @@
           <w:szCs w:val="28"/>
         </w:rPr>
       </w:pPr>
-      <w:bookmarkStart w:id="12" w:name="_Toc239067893"/>
       <w:r>
         <w:rPr>
           <w:b/>
@@ -11592,6 +13590,7 @@
           <w:szCs w:val="28"/>
         </w:rPr>
       </w:pPr>
+      <w:bookmarkStart w:id="17" w:name="_Toc239278361"/>
       <w:r>
         <w:rPr>
           <w:rFonts w:ascii="Calibri" w:hAnsi="Calibri" w:cs="Calibri"/>
@@ -11604,7 +13603,7 @@
         <w:lastRenderedPageBreak/>
         <w:t>5. Arquitectura de software</w:t>
       </w:r>
-      <w:bookmarkEnd w:id="12"/>
+      <w:bookmarkEnd w:id="17"/>
     </w:p>
     <w:p>
       <w:pPr>
@@ -12555,7 +14554,7 @@
           <w:szCs w:val="24"/>
         </w:rPr>
       </w:pPr>
-      <w:bookmarkStart w:id="13" w:name="_Toc239067894"/>
+      <w:bookmarkStart w:id="18" w:name="_Toc239278362"/>
       <w:r>
         <w:rPr>
           <w:rFonts w:ascii="Calibri" w:hAnsi="Calibri" w:cs="Calibri"/>
@@ -12567,7 +14566,7 @@
         </w:rPr>
         <w:t>5.1. Arquitectura lógica</w:t>
       </w:r>
-      <w:bookmarkEnd w:id="13"/>
+      <w:bookmarkEnd w:id="18"/>
     </w:p>
     <w:p>
       <w:pPr>
@@ -12972,7 +14971,7 @@
           <w:szCs w:val="24"/>
         </w:rPr>
       </w:pPr>
-      <w:bookmarkStart w:id="14" w:name="_Toc239067895"/>
+      <w:bookmarkStart w:id="19" w:name="_Toc239278363"/>
       <w:r>
         <w:rPr>
           <w:rFonts w:ascii="Calibri" w:hAnsi="Calibri" w:cs="Calibri"/>
@@ -12985,7 +14984,7 @@
         <w:lastRenderedPageBreak/>
         <w:t>5.2. Arquitectura física</w:t>
       </w:r>
-      <w:bookmarkEnd w:id="14"/>
+      <w:bookmarkEnd w:id="19"/>
     </w:p>
     <w:p>
       <w:pPr>
@@ -13259,7 +15258,7 @@
           <w:szCs w:val="28"/>
         </w:rPr>
       </w:pPr>
-      <w:bookmarkStart w:id="15" w:name="_Toc239067896"/>
+      <w:bookmarkStart w:id="20" w:name="_Toc239278364"/>
       <w:r>
         <w:rPr>
           <w:rFonts w:ascii="Calibri" w:hAnsi="Calibri" w:cs="Calibri"/>
@@ -13272,7 +15271,7 @@
         <w:lastRenderedPageBreak/>
         <w:t>6. Diseño de base de datos</w:t>
       </w:r>
-      <w:bookmarkEnd w:id="15"/>
+      <w:bookmarkEnd w:id="20"/>
     </w:p>
     <w:p>
       <w:pPr>
@@ -13291,7 +15290,7 @@
         </w:rPr>
         <w:tab/>
       </w:r>
-      <w:bookmarkStart w:id="16" w:name="_Toc239067897"/>
+      <w:bookmarkStart w:id="21" w:name="_Toc239278365"/>
       <w:r>
         <w:rPr>
           <w:rFonts w:ascii="Calibri" w:hAnsi="Calibri" w:cs="Calibri"/>
@@ -13315,7 +15314,7 @@
         </w:rPr>
         <w:t>(MER)</w:t>
       </w:r>
-      <w:bookmarkEnd w:id="16"/>
+      <w:bookmarkEnd w:id="21"/>
     </w:p>
     <w:p>
       <w:pPr>
@@ -13324,13 +15323,7 @@
         <w:jc w:val="both"/>
       </w:pPr>
       <w:r>
-        <w:t xml:space="preserve">El modelo entidad-relación del sistema se compone de </w:t>
-      </w:r>
-      <w:r>
-        <w:t xml:space="preserve">diez </w:t>
-      </w:r>
-      <w:r>
-        <w:t>entidades, agrupadas en cuatro categorías: seguridad (Rol, Usuario), paramétrica (</w:t>
+        <w:t>El modelo entidad-relación del sistema se compone de diez entidades, agrupadas en cuatro categorías: seguridad (Rol, Usuario), paramétrica (</w:t>
       </w:r>
       <w:proofErr w:type="spellStart"/>
       <w:r>
@@ -13501,6 +15494,7 @@
       <w:r>
         <w:tab/>
       </w:r>
+      <w:bookmarkStart w:id="22" w:name="_Toc239278366"/>
       <w:r>
         <w:rPr>
           <w:rFonts w:ascii="Calibri" w:hAnsi="Calibri" w:cs="Calibri"/>
@@ -13512,6 +15506,7 @@
         </w:rPr>
         <w:t>6.2. Diseño Lógico</w:t>
       </w:r>
+      <w:bookmarkEnd w:id="22"/>
     </w:p>
     <w:p>
       <w:pPr>
@@ -14718,6 +16713,7 @@
       <w:r>
         <w:tab/>
       </w:r>
+      <w:bookmarkStart w:id="23" w:name="_Toc239278367"/>
       <w:r>
         <w:rPr>
           <w:rFonts w:ascii="Calibri" w:hAnsi="Calibri" w:cs="Calibri"/>
@@ -14729,6 +16725,7 @@
         </w:rPr>
         <w:t>6.3. Diseño físico</w:t>
       </w:r>
+      <w:bookmarkEnd w:id="23"/>
     </w:p>
     <w:p>
       <w:pPr>
@@ -14745,13 +16742,7 @@
       </w:r>
       <w:proofErr w:type="spellEnd"/>
       <w:r>
-        <w:t xml:space="preserve"> propia de PostgreSQL</w:t>
-      </w:r>
-      <w:r>
-        <w:t xml:space="preserve">, </w:t>
-      </w:r>
-      <w:r>
-        <w:t>mientras que las columnas conservan el prefijo normalizado de tres o cuatro letras exigido por la cátedra (</w:t>
+        <w:t xml:space="preserve"> propia de PostgreSQL, mientras que las columnas conservan el prefijo normalizado de tres o cuatro letras exigido por la cátedra (</w:t>
       </w:r>
       <w:proofErr w:type="spellStart"/>
       <w:r>
@@ -14796,16 +16787,7 @@
         <w:t>Llaves primarias:</w:t>
       </w:r>
       <w:r>
-        <w:t xml:space="preserve"> </w:t>
-      </w:r>
-      <w:r>
-        <w:t>C</w:t>
-      </w:r>
-      <w:r>
-        <w:t>olumnas INTEGER GENERATED ALWAYS AS IDENTITY</w:t>
-      </w:r>
-      <w:r>
-        <w:t xml:space="preserve"> </w:t>
+        <w:t xml:space="preserve"> Columnas INTEGER GENERATED ALWAYS AS IDENTITY </w:t>
       </w:r>
       <w:r>
         <w:rPr>
@@ -14997,10 +16979,7 @@
       </w:r>
       <w:proofErr w:type="spellEnd"/>
       <w:r>
-        <w:t xml:space="preserve"> = TRUE (regla de negocio del caso, validada también a nivel de aplicación)</w:t>
-      </w:r>
-      <w:r>
-        <w:t>.</w:t>
+        <w:t xml:space="preserve"> = TRUE (regla de negocio del caso, validada también a nivel de aplicación).</w:t>
       </w:r>
     </w:p>
     <w:p>
@@ -15130,13 +17109,7 @@
         <w:t>Índices:</w:t>
       </w:r>
       <w:r>
-        <w:t xml:space="preserve"> </w:t>
-      </w:r>
-      <w:r>
-        <w:t>S</w:t>
-      </w:r>
-      <w:r>
-        <w:t xml:space="preserve">e crean índices sobre </w:t>
+        <w:t xml:space="preserve"> Se crean índices sobre </w:t>
       </w:r>
       <w:proofErr w:type="spellStart"/>
       <w:r>
@@ -15214,13 +17187,7 @@
         <w:t>Concurrencia en el control de aforo:</w:t>
       </w:r>
       <w:r>
-        <w:t xml:space="preserve"> </w:t>
-      </w:r>
-      <w:r>
-        <w:t>L</w:t>
-      </w:r>
-      <w:r>
-        <w:t xml:space="preserve">a actualización de </w:t>
+        <w:t xml:space="preserve"> La actualización de </w:t>
       </w:r>
       <w:proofErr w:type="spellStart"/>
       <w:r>
@@ -15296,6 +17263,9 @@
         <w:jc w:val="both"/>
       </w:pPr>
       <w:r>
+        <w:rPr>
+          <w:noProof/>
+        </w:rPr>
         <w:drawing>
           <wp:inline distT="0" distB="0" distL="0" distR="0" wp14:anchorId="4351EC95" wp14:editId="7E476AEF">
             <wp:extent cx="5400040" cy="5892165"/>
@@ -15346,6 +17316,7 @@
           <w:szCs w:val="24"/>
         </w:rPr>
       </w:pPr>
+      <w:bookmarkStart w:id="24" w:name="_Toc239278368"/>
       <w:r>
         <w:rPr>
           <w:rFonts w:ascii="Calibri" w:hAnsi="Calibri" w:cs="Calibri"/>
@@ -15358,6 +17329,7 @@
         <w:lastRenderedPageBreak/>
         <w:t>6.4. Diccionario de datos</w:t>
       </w:r>
+      <w:bookmarkEnd w:id="24"/>
     </w:p>
     <w:p>
       <w:pPr>
@@ -28737,6 +30709,7 @@
           <w:szCs w:val="28"/>
         </w:rPr>
       </w:pPr>
+      <w:bookmarkStart w:id="25" w:name="_Toc239278369"/>
       <w:r>
         <w:rPr>
           <w:rFonts w:ascii="Calibri" w:hAnsi="Calibri" w:cs="Calibri"/>
@@ -28761,6 +30734,7 @@
         </w:rPr>
         <w:t>sprints</w:t>
       </w:r>
+      <w:bookmarkEnd w:id="25"/>
       <w:proofErr w:type="spellEnd"/>
     </w:p>
     <w:p>
@@ -29516,6 +31490,7 @@
       <w:r>
         <w:tab/>
       </w:r>
+      <w:bookmarkStart w:id="26" w:name="_Toc239278370"/>
       <w:r>
         <w:rPr>
           <w:rFonts w:ascii="Calibri" w:hAnsi="Calibri" w:cs="Calibri"/>
@@ -29527,6 +31502,7 @@
         </w:rPr>
         <w:t>7.1. Sprint 0 – Fase de inicio y entorno:</w:t>
       </w:r>
+      <w:bookmarkEnd w:id="26"/>
     </w:p>
     <w:p>
       <w:pPr>
@@ -29721,6 +31697,7 @@
           <w:szCs w:val="24"/>
         </w:rPr>
       </w:pPr>
+      <w:bookmarkStart w:id="27" w:name="_Toc239278371"/>
       <w:r>
         <w:rPr>
           <w:rFonts w:ascii="Calibri" w:hAnsi="Calibri" w:cs="Calibri"/>
@@ -29732,6 +31709,7 @@
         </w:rPr>
         <w:t>7.2. Sprint 1 – Gestión de estaciones y registro turístico</w:t>
       </w:r>
+      <w:bookmarkEnd w:id="27"/>
     </w:p>
     <w:p>
       <w:pPr>
@@ -29903,6 +31881,7 @@
           <w:szCs w:val="24"/>
         </w:rPr>
       </w:pPr>
+      <w:bookmarkStart w:id="28" w:name="_Toc239278372"/>
       <w:r>
         <w:rPr>
           <w:rFonts w:ascii="Calibri" w:hAnsi="Calibri" w:cs="Calibri"/>
@@ -29914,6 +31893,7 @@
         </w:rPr>
         <w:t>7.3. Sprint 2 – Motor de rutas peatonales y clima</w:t>
       </w:r>
+      <w:bookmarkEnd w:id="28"/>
     </w:p>
     <w:p>
       <w:pPr>
@@ -30083,6 +32063,7 @@
           <w:szCs w:val="24"/>
         </w:rPr>
       </w:pPr>
+      <w:bookmarkStart w:id="29" w:name="_Toc239278373"/>
       <w:r>
         <w:rPr>
           <w:rFonts w:ascii="Calibri" w:hAnsi="Calibri" w:cs="Calibri"/>
@@ -30093,7 +32074,19 @@
           <w:szCs w:val="24"/>
         </w:rPr>
         <w:lastRenderedPageBreak/>
-        <w:t xml:space="preserve">7.4. Sprint 3 – Spring </w:t>
+        <w:t>7.4. Sprint 3 – Spring</w:t>
+      </w:r>
+      <w:bookmarkEnd w:id="29"/>
+      <w:r>
+        <w:rPr>
+          <w:rFonts w:ascii="Calibri" w:hAnsi="Calibri" w:cs="Calibri"/>
+          <w:b/>
+          <w:bCs/>
+          <w:color w:val="auto"/>
+          <w:sz w:val="24"/>
+          <w:szCs w:val="24"/>
+        </w:rPr>
+        <w:t xml:space="preserve"> </w:t>
       </w:r>
     </w:p>
     <w:p>
@@ -30234,6 +32227,7 @@
           <w:szCs w:val="24"/>
         </w:rPr>
       </w:pPr>
+      <w:bookmarkStart w:id="30" w:name="_Toc239278374"/>
       <w:r>
         <w:rPr>
           <w:rFonts w:ascii="Calibri" w:hAnsi="Calibri" w:cs="Calibri"/>
@@ -30245,6 +32239,7 @@
         </w:rPr>
         <w:t>7.5. Sprint 4 – Informes consolidados, optimización y entrega</w:t>
       </w:r>
+      <w:bookmarkEnd w:id="30"/>
     </w:p>
     <w:p>
       <w:pPr>
@@ -30489,6 +32484,7 @@
           <w:szCs w:val="28"/>
         </w:rPr>
       </w:pPr>
+      <w:bookmarkStart w:id="31" w:name="_Toc239278375"/>
       <w:r>
         <w:rPr>
           <w:rFonts w:ascii="Calibri" w:hAnsi="Calibri" w:cs="Calibri"/>
@@ -30501,6 +32497,7 @@
         <w:lastRenderedPageBreak/>
         <w:t>8. Plan de pruebas y calidad</w:t>
       </w:r>
+      <w:bookmarkEnd w:id="31"/>
     </w:p>
     <w:p>
       <w:pPr>
@@ -30517,6 +32514,7 @@
       <w:r>
         <w:tab/>
       </w:r>
+      <w:bookmarkStart w:id="32" w:name="_Toc239278376"/>
       <w:r>
         <w:rPr>
           <w:rFonts w:ascii="Calibri" w:hAnsi="Calibri" w:cs="Calibri"/>
@@ -30528,6 +32526,7 @@
         </w:rPr>
         <w:t>8.1. Planificación de pruebas</w:t>
       </w:r>
+      <w:bookmarkEnd w:id="32"/>
     </w:p>
     <w:p>
       <w:pPr>
@@ -30690,6 +32689,7 @@
           <w:lang w:val="es-ES"/>
         </w:rPr>
       </w:pPr>
+      <w:bookmarkStart w:id="33" w:name="_Toc239278377"/>
       <w:r>
         <w:rPr>
           <w:rFonts w:ascii="Calibri" w:hAnsi="Calibri" w:cs="Calibri"/>
@@ -30713,6 +32713,7 @@
         </w:rPr>
         <w:t>2. Pruebas funcionales</w:t>
       </w:r>
+      <w:bookmarkEnd w:id="33"/>
     </w:p>
     <w:p>
       <w:pPr>
@@ -30741,6 +32742,7 @@
       <w:r>
         <w:tab/>
       </w:r>
+      <w:bookmarkStart w:id="34" w:name="_Toc239278378"/>
       <w:r>
         <w:rPr>
           <w:b/>
@@ -30751,6 +32753,7 @@
         </w:rPr>
         <w:t>8.2.1. Pruebas de caja blanca</w:t>
       </w:r>
+      <w:bookmarkEnd w:id="34"/>
     </w:p>
     <w:p>
       <w:pPr>
@@ -30796,35 +32799,7 @@
           <w:b/>
           <w:bCs/>
         </w:rPr>
-        <w:t>Componente</w:t>
-      </w:r>
-      <w:r>
-        <w:rPr>
-          <w:b/>
-          <w:bCs/>
-        </w:rPr>
-        <w:t>s</w:t>
-      </w:r>
-      <w:r>
-        <w:rPr>
-          <w:b/>
-          <w:bCs/>
-        </w:rPr>
-        <w:t xml:space="preserve"> Evaluado</w:t>
-      </w:r>
-      <w:r>
-        <w:rPr>
-          <w:b/>
-          <w:bCs/>
-        </w:rPr>
-        <w:t>s</w:t>
-      </w:r>
-      <w:r>
-        <w:rPr>
-          <w:b/>
-          <w:bCs/>
-        </w:rPr>
-        <w:t xml:space="preserve">: </w:t>
+        <w:t xml:space="preserve">Componentes Evaluados: </w:t>
       </w:r>
       <w:proofErr w:type="spellStart"/>
       <w:r>
@@ -33337,6 +35312,7 @@
           <w:szCs w:val="22"/>
         </w:rPr>
       </w:pPr>
+      <w:bookmarkStart w:id="35" w:name="_Toc239278379"/>
       <w:r>
         <w:rPr>
           <w:b/>
@@ -33347,6 +35323,7 @@
         </w:rPr>
         <w:t>8.2.2. Pruebas de caja negra</w:t>
       </w:r>
+      <w:bookmarkEnd w:id="35"/>
     </w:p>
     <w:p>
       <w:pPr>
@@ -33437,12 +35414,6 @@
         </w:rPr>
         <w:lastRenderedPageBreak/>
         <w:br/>
-      </w:r>
-      <w:r>
-        <w:rPr>
-          <w:b/>
-          <w:bCs/>
-        </w:rPr>
         <w:t>Matriz de Casos de Prueba de Caja Negra</w:t>
       </w:r>
     </w:p>
@@ -33738,12 +35709,6 @@
                 <w:szCs w:val="17"/>
               </w:rPr>
               <w:br/>
-            </w:r>
-            <w:r>
-              <w:rPr>
-                <w:sz w:val="17"/>
-                <w:szCs w:val="17"/>
-              </w:rPr>
               <w:t xml:space="preserve">2) Seleccionar categoría "Naturaleza". </w:t>
             </w:r>
             <w:r>
@@ -33752,12 +35717,6 @@
                 <w:szCs w:val="17"/>
               </w:rPr>
               <w:br/>
-            </w:r>
-            <w:r>
-              <w:rPr>
-                <w:sz w:val="17"/>
-                <w:szCs w:val="17"/>
-              </w:rPr>
               <w:t xml:space="preserve">3) Indicar tiempo disponible "Medio día" y dificultad "Media". </w:t>
             </w:r>
             <w:r>
@@ -33766,12 +35725,6 @@
                 <w:szCs w:val="17"/>
               </w:rPr>
               <w:br/>
-            </w:r>
-            <w:r>
-              <w:rPr>
-                <w:sz w:val="17"/>
-                <w:szCs w:val="17"/>
-              </w:rPr>
               <w:t>4) Seleccionar estación de partida "Ollantaytambo". 5) Clic en "Buscar zonas turísticas".</w:t>
             </w:r>
           </w:p>
@@ -33932,12 +35885,6 @@
                 <w:szCs w:val="17"/>
               </w:rPr>
               <w:br/>
-            </w:r>
-            <w:r>
-              <w:rPr>
-                <w:sz w:val="17"/>
-                <w:szCs w:val="17"/>
-              </w:rPr>
               <w:t>2) Intentar ubicar una estación con EstEstado=Inactiva en el listado.</w:t>
             </w:r>
           </w:p>
@@ -34259,12 +36206,6 @@
                 <w:szCs w:val="17"/>
               </w:rPr>
               <w:br/>
-            </w:r>
-            <w:r>
-              <w:rPr>
-                <w:sz w:val="17"/>
-                <w:szCs w:val="17"/>
-              </w:rPr>
               <w:t xml:space="preserve">2) Ingresar nombre, descripción, tipo(s) de turismo y estación cercana. </w:t>
             </w:r>
             <w:r>
@@ -34273,12 +36214,6 @@
                 <w:szCs w:val="17"/>
               </w:rPr>
               <w:br/>
-            </w:r>
-            <w:r>
-              <w:rPr>
-                <w:sz w:val="17"/>
-                <w:szCs w:val="17"/>
-              </w:rPr>
               <w:t>3) Clic en "Guardar".</w:t>
             </w:r>
           </w:p>
@@ -34481,12 +36416,6 @@
                 <w:szCs w:val="17"/>
               </w:rPr>
               <w:br/>
-            </w:r>
-            <w:r>
-              <w:rPr>
-                <w:sz w:val="17"/>
-                <w:szCs w:val="17"/>
-              </w:rPr>
               <w:t xml:space="preserve">2) Dejar el campo "Tipo(s) de turismo" sin seleccionar ninguna opción. </w:t>
             </w:r>
             <w:r>
@@ -34495,12 +36424,6 @@
                 <w:szCs w:val="17"/>
               </w:rPr>
               <w:br/>
-            </w:r>
-            <w:r>
-              <w:rPr>
-                <w:sz w:val="17"/>
-                <w:szCs w:val="17"/>
-              </w:rPr>
               <w:t>3) Clic en "Guardar".</w:t>
             </w:r>
           </w:p>
@@ -34686,12 +36609,6 @@
                 <w:szCs w:val="17"/>
               </w:rPr>
               <w:br/>
-            </w:r>
-            <w:r>
-              <w:rPr>
-                <w:sz w:val="17"/>
-                <w:szCs w:val="17"/>
-              </w:rPr>
               <w:t>2) Verificar que la tabla se muestre sin opciones de edición o eliminación.</w:t>
             </w:r>
           </w:p>
@@ -34852,12 +36769,6 @@
                 <w:szCs w:val="17"/>
               </w:rPr>
               <w:br/>
-            </w:r>
-            <w:r>
-              <w:rPr>
-                <w:sz w:val="17"/>
-                <w:szCs w:val="17"/>
-              </w:rPr>
               <w:t>2) Seleccionar formato "PDF".</w:t>
             </w:r>
           </w:p>
@@ -35234,12 +37145,6 @@
                 <w:szCs w:val="17"/>
               </w:rPr>
               <w:br/>
-            </w:r>
-            <w:r>
-              <w:rPr>
-                <w:sz w:val="17"/>
-                <w:szCs w:val="17"/>
-              </w:rPr>
               <w:t xml:space="preserve">2) Elegir la fecha ya completa. </w:t>
             </w:r>
             <w:r>
@@ -35248,12 +37153,6 @@
                 <w:szCs w:val="17"/>
               </w:rPr>
               <w:br/>
-            </w:r>
-            <w:r>
-              <w:rPr>
-                <w:sz w:val="17"/>
-                <w:szCs w:val="17"/>
-              </w:rPr>
               <w:t>3) Clic en "Generar informe".</w:t>
             </w:r>
           </w:p>
@@ -35424,12 +37323,6 @@
                 <w:szCs w:val="17"/>
               </w:rPr>
               <w:br/>
-            </w:r>
-            <w:r>
-              <w:rPr>
-                <w:sz w:val="17"/>
-                <w:szCs w:val="17"/>
-              </w:rPr>
               <w:t xml:space="preserve">2) Guardar. </w:t>
             </w:r>
             <w:r>
@@ -35438,12 +37331,6 @@
                 <w:szCs w:val="17"/>
               </w:rPr>
               <w:br/>
-            </w:r>
-            <w:r>
-              <w:rPr>
-                <w:sz w:val="17"/>
-                <w:szCs w:val="17"/>
-              </w:rPr>
               <w:t>3) Como turista, buscar zonas con preferencia "Naturaleza" y, por separado, con preferencia "Historia/Cultura", ambas desde la estación Ollantaytambo.</w:t>
             </w:r>
           </w:p>
@@ -38728,6 +40615,92 @@
     </w:lvl>
   </w:abstractNum>
   <w:abstractNum w:abstractNumId="27" w15:restartNumberingAfterBreak="0">
+    <w:nsid w:val="72086B35"/>
+    <w:multiLevelType w:val="hybridMultilevel"/>
+    <w:tmpl w:val="C546C3CE"/>
+    <w:lvl w:ilvl="0" w:tplc="4BCAE222">
+      <w:start w:val="1"/>
+      <w:numFmt w:val="bullet"/>
+      <w:lvlText w:val="●"/>
+      <w:lvlJc w:val="left"/>
+      <w:pPr>
+        <w:ind w:left="1428" w:hanging="360"/>
+      </w:pPr>
+    </w:lvl>
+    <w:lvl w:ilvl="1" w:tplc="D0BC32E6">
+      <w:start w:val="1"/>
+      <w:numFmt w:val="bullet"/>
+      <w:lvlText w:val="○"/>
+      <w:lvlJc w:val="left"/>
+      <w:pPr>
+        <w:ind w:left="2148" w:hanging="360"/>
+      </w:pPr>
+    </w:lvl>
+    <w:lvl w:ilvl="2" w:tplc="E7261B8E">
+      <w:start w:val="1"/>
+      <w:numFmt w:val="bullet"/>
+      <w:lvlText w:val="■"/>
+      <w:lvlJc w:val="left"/>
+      <w:pPr>
+        <w:ind w:left="2868" w:hanging="360"/>
+      </w:pPr>
+    </w:lvl>
+    <w:lvl w:ilvl="3" w:tplc="6F940740">
+      <w:start w:val="1"/>
+      <w:numFmt w:val="bullet"/>
+      <w:lvlText w:val="●"/>
+      <w:lvlJc w:val="left"/>
+      <w:pPr>
+        <w:ind w:left="3588" w:hanging="360"/>
+      </w:pPr>
+    </w:lvl>
+    <w:lvl w:ilvl="4" w:tplc="6C429178">
+      <w:start w:val="1"/>
+      <w:numFmt w:val="bullet"/>
+      <w:lvlText w:val="○"/>
+      <w:lvlJc w:val="left"/>
+      <w:pPr>
+        <w:ind w:left="4308" w:hanging="360"/>
+      </w:pPr>
+    </w:lvl>
+    <w:lvl w:ilvl="5" w:tplc="26DC5042">
+      <w:start w:val="1"/>
+      <w:numFmt w:val="bullet"/>
+      <w:lvlText w:val="■"/>
+      <w:lvlJc w:val="left"/>
+      <w:pPr>
+        <w:ind w:left="5028" w:hanging="360"/>
+      </w:pPr>
+    </w:lvl>
+    <w:lvl w:ilvl="6" w:tplc="72E42490">
+      <w:start w:val="1"/>
+      <w:numFmt w:val="bullet"/>
+      <w:lvlText w:val="●"/>
+      <w:lvlJc w:val="left"/>
+      <w:pPr>
+        <w:ind w:left="5748" w:hanging="360"/>
+      </w:pPr>
+    </w:lvl>
+    <w:lvl w:ilvl="7" w:tplc="F6F82516">
+      <w:start w:val="1"/>
+      <w:numFmt w:val="bullet"/>
+      <w:lvlText w:val="●"/>
+      <w:lvlJc w:val="left"/>
+      <w:pPr>
+        <w:ind w:left="6468" w:hanging="360"/>
+      </w:pPr>
+    </w:lvl>
+    <w:lvl w:ilvl="8" w:tplc="05E441C8">
+      <w:start w:val="1"/>
+      <w:numFmt w:val="bullet"/>
+      <w:lvlText w:val="●"/>
+      <w:lvlJc w:val="left"/>
+      <w:pPr>
+        <w:ind w:left="7188" w:hanging="360"/>
+      </w:pPr>
+    </w:lvl>
+  </w:abstractNum>
+  <w:abstractNum w:abstractNumId="28" w15:restartNumberingAfterBreak="0">
     <w:nsid w:val="76335502"/>
     <w:multiLevelType w:val="hybridMultilevel"/>
     <w:tmpl w:val="F04424FE"/>
@@ -38836,6 +40809,119 @@
       <w:lvlJc w:val="left"/>
       <w:pPr>
         <w:ind w:left="6480" w:hanging="360"/>
+      </w:pPr>
+      <w:rPr>
+        <w:rFonts w:ascii="Wingdings" w:hAnsi="Wingdings" w:hint="default"/>
+      </w:rPr>
+    </w:lvl>
+  </w:abstractNum>
+  <w:abstractNum w:abstractNumId="29" w15:restartNumberingAfterBreak="0">
+    <w:nsid w:val="79365B0D"/>
+    <w:multiLevelType w:val="hybridMultilevel"/>
+    <w:tmpl w:val="B0C65392"/>
+    <w:lvl w:ilvl="0" w:tplc="280A0001">
+      <w:start w:val="1"/>
+      <w:numFmt w:val="bullet"/>
+      <w:lvlText w:val=""/>
+      <w:lvlJc w:val="left"/>
+      <w:pPr>
+        <w:ind w:left="1428" w:hanging="360"/>
+      </w:pPr>
+      <w:rPr>
+        <w:rFonts w:ascii="Symbol" w:hAnsi="Symbol" w:hint="default"/>
+      </w:rPr>
+    </w:lvl>
+    <w:lvl w:ilvl="1" w:tplc="280A0003" w:tentative="1">
+      <w:start w:val="1"/>
+      <w:numFmt w:val="bullet"/>
+      <w:lvlText w:val="o"/>
+      <w:lvlJc w:val="left"/>
+      <w:pPr>
+        <w:ind w:left="2148" w:hanging="360"/>
+      </w:pPr>
+      <w:rPr>
+        <w:rFonts w:ascii="Courier New" w:hAnsi="Courier New" w:cs="Courier New" w:hint="default"/>
+      </w:rPr>
+    </w:lvl>
+    <w:lvl w:ilvl="2" w:tplc="280A0005" w:tentative="1">
+      <w:start w:val="1"/>
+      <w:numFmt w:val="bullet"/>
+      <w:lvlText w:val=""/>
+      <w:lvlJc w:val="left"/>
+      <w:pPr>
+        <w:ind w:left="2868" w:hanging="360"/>
+      </w:pPr>
+      <w:rPr>
+        <w:rFonts w:ascii="Wingdings" w:hAnsi="Wingdings" w:hint="default"/>
+      </w:rPr>
+    </w:lvl>
+    <w:lvl w:ilvl="3" w:tplc="280A0001" w:tentative="1">
+      <w:start w:val="1"/>
+      <w:numFmt w:val="bullet"/>
+      <w:lvlText w:val=""/>
+      <w:lvlJc w:val="left"/>
+      <w:pPr>
+        <w:ind w:left="3588" w:hanging="360"/>
+      </w:pPr>
+      <w:rPr>
+        <w:rFonts w:ascii="Symbol" w:hAnsi="Symbol" w:hint="default"/>
+      </w:rPr>
+    </w:lvl>
+    <w:lvl w:ilvl="4" w:tplc="280A0003" w:tentative="1">
+      <w:start w:val="1"/>
+      <w:numFmt w:val="bullet"/>
+      <w:lvlText w:val="o"/>
+      <w:lvlJc w:val="left"/>
+      <w:pPr>
+        <w:ind w:left="4308" w:hanging="360"/>
+      </w:pPr>
+      <w:rPr>
+        <w:rFonts w:ascii="Courier New" w:hAnsi="Courier New" w:cs="Courier New" w:hint="default"/>
+      </w:rPr>
+    </w:lvl>
+    <w:lvl w:ilvl="5" w:tplc="280A0005" w:tentative="1">
+      <w:start w:val="1"/>
+      <w:numFmt w:val="bullet"/>
+      <w:lvlText w:val=""/>
+      <w:lvlJc w:val="left"/>
+      <w:pPr>
+        <w:ind w:left="5028" w:hanging="360"/>
+      </w:pPr>
+      <w:rPr>
+        <w:rFonts w:ascii="Wingdings" w:hAnsi="Wingdings" w:hint="default"/>
+      </w:rPr>
+    </w:lvl>
+    <w:lvl w:ilvl="6" w:tplc="280A0001" w:tentative="1">
+      <w:start w:val="1"/>
+      <w:numFmt w:val="bullet"/>
+      <w:lvlText w:val=""/>
+      <w:lvlJc w:val="left"/>
+      <w:pPr>
+        <w:ind w:left="5748" w:hanging="360"/>
+      </w:pPr>
+      <w:rPr>
+        <w:rFonts w:ascii="Symbol" w:hAnsi="Symbol" w:hint="default"/>
+      </w:rPr>
+    </w:lvl>
+    <w:lvl w:ilvl="7" w:tplc="280A0003" w:tentative="1">
+      <w:start w:val="1"/>
+      <w:numFmt w:val="bullet"/>
+      <w:lvlText w:val="o"/>
+      <w:lvlJc w:val="left"/>
+      <w:pPr>
+        <w:ind w:left="6468" w:hanging="360"/>
+      </w:pPr>
+      <w:rPr>
+        <w:rFonts w:ascii="Courier New" w:hAnsi="Courier New" w:cs="Courier New" w:hint="default"/>
+      </w:rPr>
+    </w:lvl>
+    <w:lvl w:ilvl="8" w:tplc="280A0005" w:tentative="1">
+      <w:start w:val="1"/>
+      <w:numFmt w:val="bullet"/>
+      <w:lvlText w:val=""/>
+      <w:lvlJc w:val="left"/>
+      <w:pPr>
+        <w:ind w:left="7188" w:hanging="360"/>
       </w:pPr>
       <w:rPr>
         <w:rFonts w:ascii="Wingdings" w:hAnsi="Wingdings" w:hint="default"/>
@@ -38882,7 +40968,7 @@
     <w:abstractNumId w:val="20"/>
   </w:num>
   <w:num w:numId="14" w16cid:durableId="1641692727">
-    <w:abstractNumId w:val="27"/>
+    <w:abstractNumId w:val="28"/>
   </w:num>
   <w:num w:numId="15" w16cid:durableId="642779006">
     <w:abstractNumId w:val="9"/>
@@ -38925,6 +41011,21 @@
   </w:num>
   <w:num w:numId="28" w16cid:durableId="142284599">
     <w:abstractNumId w:val="21"/>
+  </w:num>
+  <w:num w:numId="29" w16cid:durableId="1198589194">
+    <w:abstractNumId w:val="29"/>
+  </w:num>
+  <w:num w:numId="30" w16cid:durableId="582684716">
+    <w:abstractNumId w:val="27"/>
+    <w:lvlOverride w:ilvl="0"/>
+    <w:lvlOverride w:ilvl="1"/>
+    <w:lvlOverride w:ilvl="2"/>
+    <w:lvlOverride w:ilvl="3"/>
+    <w:lvlOverride w:ilvl="4"/>
+    <w:lvlOverride w:ilvl="5"/>
+    <w:lvlOverride w:ilvl="6"/>
+    <w:lvlOverride w:ilvl="7"/>
+    <w:lvlOverride w:ilvl="8"/>
   </w:num>
 </w:numbering>
 </file>
@@ -39128,7 +41229,7 @@
     <w:lsdException w:name="Medium Shading 2 Accent 1" w:uiPriority="64"/>
     <w:lsdException w:name="Medium List 1 Accent 1" w:uiPriority="65"/>
     <w:lsdException w:name="Revision" w:semiHidden="1"/>
-    <w:lsdException w:name="List Paragraph" w:uiPriority="34" w:qFormat="1"/>
+    <w:lsdException w:name="List Paragraph" w:uiPriority="0" w:qFormat="1"/>
     <w:lsdException w:name="Quote" w:uiPriority="29" w:qFormat="1"/>
     <w:lsdException w:name="Intense Quote" w:uiPriority="30" w:qFormat="1"/>
     <w:lsdException w:name="Medium List 2 Accent 1" w:uiPriority="66"/>
@@ -39542,7 +41643,6 @@
   <w:style w:type="character" w:default="1" w:styleId="Fuentedeprrafopredeter">
     <w:name w:val="Default Paragraph Font"/>
     <w:uiPriority w:val="1"/>
-    <w:semiHidden/>
     <w:unhideWhenUsed/>
   </w:style>
   <w:style w:type="table" w:default="1" w:styleId="Tablanormal">
@@ -39785,7 +41885,6 @@
   <w:style w:type="paragraph" w:styleId="Prrafodelista">
     <w:name w:val="List Paragraph"/>
     <w:basedOn w:val="Normal"/>
-    <w:uiPriority w:val="34"/>
     <w:qFormat/>
     <w:rsid w:val="005266DD"/>
     <w:pPr>

</xml_diff>

<commit_message>
Arreglando documentacion, faltaba especificar la existencia de 1 rol
</commit_message>
<xml_diff>
--- a/docs/ProyectoFinalSOftware.docx
+++ b/docs/ProyectoFinalSOftware.docx
@@ -100,13 +100,13 @@
             <wp:extent cx="949960" cy="858520"/>
             <wp:effectExtent l="0" t="0" r="0" b="0"/>
             <wp:wrapSquare wrapText="bothSides" distT="0" distB="0" distL="114300" distR="114300"/>
-            <wp:docPr id="7" name="image1.png" descr="Diagrama&#10;&#10;Descripción generada automáticamente"/>
+            <wp:docPr id="7" name="image1.png" descr="Diagrama&amp;#xA;&amp;#xA;Descripción generada automáticamente"/>
             <wp:cNvGraphicFramePr/>
             <a:graphic xmlns:a="http://schemas.openxmlformats.org/drawingml/2006/main">
               <a:graphicData uri="http://schemas.openxmlformats.org/drawingml/2006/picture">
                 <pic:pic xmlns:pic="http://schemas.openxmlformats.org/drawingml/2006/picture">
                   <pic:nvPicPr>
-                    <pic:cNvPr id="0" name="image1.png" descr="Diagrama&#10;&#10;Descripción generada automáticamente"/>
+                    <pic:cNvPr id="0" name="image1.png" descr="Diagrama&amp;#xA;&amp;#xA;Descripción generada automáticamente"/>
                     <pic:cNvPicPr preferRelativeResize="0"/>
                   </pic:nvPicPr>
                   <pic:blipFill>
@@ -9869,15 +9869,7 @@
         <w:t xml:space="preserve">RF-12 (Media): </w:t>
       </w:r>
       <w:r>
-        <w:t xml:space="preserve">El sistema debe permitir a un administrador de </w:t>
-      </w:r>
-      <w:proofErr w:type="spellStart"/>
-      <w:r>
-        <w:t>PeruRail</w:t>
-      </w:r>
-      <w:proofErr w:type="spellEnd"/>
-      <w:r>
-        <w:t xml:space="preserve"> mantener los horarios y precios de los servicios de tren.</w:t>
+        <w:t>El sistema debe permitir a un administrador de PeruRail (rol PERURAIL_ADMIN) mantener los horarios y precios de los servicios de tren.</w:t>
       </w:r>
     </w:p>
     <w:p>
@@ -10177,7 +10169,7 @@
         <w:t xml:space="preserve">RNF-05 – Seguridad: </w:t>
       </w:r>
       <w:r>
-        <w:t>El acceso a los módulos de administración (zonas turísticas, horarios, precios) debe estar restringido según el rol del usuario (ADMIN_MTC, TRAVEL_GROUP_USER, TURISTA_PUBLICO).</w:t>
+        <w:t>El acceso a los módulos de administración (zonas turísticas, horarios, precios) debe estar restringido según el rol del usuario (ADMIN_MTC, TRAVEL_GROUP_USER, PERURAIL_ADMIN, TURISTA_PUBLICO).</w:t>
       </w:r>
     </w:p>
     <w:p>
@@ -10248,17 +10240,14 @@
           <w:b/>
           <w:bCs/>
         </w:rPr>
+        <w:lastRenderedPageBreak/>
         <w:t xml:space="preserve">RNF-08 – Concurrencia: </w:t>
       </w:r>
       <w:r>
         <w:t>El incremento del contador de aforo</w:t>
       </w:r>
       <w:r>
-        <w:t xml:space="preserve"> debe ejecutarse de forma atómica (transacción con bloqueo o incremento a </w:t>
-      </w:r>
-      <w:r>
-        <w:lastRenderedPageBreak/>
-        <w:t>nivel de base de datos), para evitar condiciones de carrera cuando dos o más turistas generan un informe para la misma zona y fecha de forma simultánea</w:t>
+        <w:t xml:space="preserve"> debe ejecutarse de forma atómica (transacción con bloqueo o incremento a nivel de base de datos), para evitar condiciones de carrera cuando dos o más turistas generan un informe para la misma zona y fecha de forma simultánea</w:t>
       </w:r>
       <w:r>
         <w:t>.</w:t>
@@ -11276,7 +11265,6 @@
                 <w:sz w:val="18"/>
                 <w:szCs w:val="18"/>
               </w:rPr>
-              <w:lastRenderedPageBreak/>
               <w:t xml:space="preserve">Nombre Historia: </w:t>
             </w:r>
             <w:r>
@@ -11824,14 +11812,7 @@
                 <w:sz w:val="18"/>
                 <w:szCs w:val="18"/>
               </w:rPr>
-              <w:t xml:space="preserve">Usuario: </w:t>
-            </w:r>
-            <w:r>
-              <w:rPr>
-                <w:sz w:val="18"/>
-                <w:szCs w:val="18"/>
-              </w:rPr>
-              <w:t>Administrador MTC / Travel Group Perú</w:t>
+              <w:t>Usuario: Administrador MTC / Travel Group Perú / PeruRail</w:t>
             </w:r>
           </w:p>
           <w:p>
@@ -11983,7 +11964,7 @@
                 <w:sz w:val="18"/>
                 <w:szCs w:val="18"/>
               </w:rPr>
-              <w:t>Yo como administrador del sistema, quiero que el acceso a los módulos de administración esté controlado mediante roles (ADMIN_MTC, TRAVEL_GROUP_USER, TURISTA_PUBLICO), para proteger la información sensible y las operaciones de mantenimiento.</w:t>
+              <w:t>Yo como administrador del sistema, quiero que el acceso a los módulos de administración esté controlado mediante roles (ADMIN_MTC, TRAVEL_GROUP_USER, PERURAIL_ADMIN, TURISTA_PUBLICO), para proteger la información sensible y las operaciones de mantenimiento.</w:t>
             </w:r>
           </w:p>
           <w:p>
@@ -12289,6 +12270,7 @@
                 <w:sz w:val="18"/>
                 <w:szCs w:val="18"/>
               </w:rPr>
+              <w:lastRenderedPageBreak/>
               <w:t>Validación:</w:t>
             </w:r>
           </w:p>
@@ -14047,7 +14029,7 @@
                 <w:sz w:val="18"/>
                 <w:szCs w:val="18"/>
               </w:rPr>
-              <w:t>Spring Security (roles ADMIN_MTC, TRAVEL_GROUP_USER, TURISTA_PUBLICO)</w:t>
+              <w:t>Spring Security (roles ADMIN_MTC, TRAVEL_GROUP_USER, PERURAIL_ADMIN, TURISTA_PUBLICO)</w:t>
             </w:r>
           </w:p>
         </w:tc>
@@ -17854,7 +17836,7 @@
                 <w:sz w:val="17"/>
                 <w:szCs w:val="17"/>
               </w:rPr>
-              <w:t>Nombre del rol de acceso (Ej.: ADMIN_MTC, TRAVEL_GROUP_USER, TURISTA_PUBLICO). Valor único.</w:t>
+              <w:t>Nombre del rol de acceso (Ej.: ADMIN_MTC, TRAVEL_GROUP_USER, PERURAIL_ADMIN, TURISTA_PUBLICO). Valor único.</w:t>
             </w:r>
           </w:p>
         </w:tc>
@@ -17877,6 +17859,7 @@
     </w:p>
     <w:p>
       <w:pPr>
+        <w:ind w:left="708"/>
         <w:rPr>
           <w:b/>
           <w:bCs/>
@@ -17888,6 +17871,34 @@
           <w:bCs/>
         </w:rPr>
         <w:tab/>
+      </w:r>
+      <w:r>
+        <w:rPr>
+          <w:b/>
+          <w:bCs/>
+        </w:rPr>
+        <w:br/>
+      </w:r>
+      <w:r>
+        <w:rPr>
+          <w:b/>
+          <w:bCs/>
+        </w:rPr>
+        <w:br/>
+      </w:r>
+      <w:r>
+        <w:rPr>
+          <w:b/>
+          <w:bCs/>
+        </w:rPr>
+        <w:lastRenderedPageBreak/>
+        <w:br/>
+      </w:r>
+      <w:r>
+        <w:rPr>
+          <w:b/>
+          <w:bCs/>
+        </w:rPr>
         <w:t>usuario</w:t>
       </w:r>
     </w:p>
@@ -17941,7 +17952,6 @@
                 <w:sz w:val="17"/>
                 <w:szCs w:val="17"/>
               </w:rPr>
-              <w:lastRenderedPageBreak/>
               <w:t>Campo</w:t>
             </w:r>
           </w:p>
@@ -20693,6 +20703,7 @@
                 <w:sz w:val="17"/>
                 <w:szCs w:val="17"/>
               </w:rPr>
+              <w:lastRenderedPageBreak/>
               <w:t>EstLongitud</w:t>
             </w:r>
             <w:proofErr w:type="spellEnd"/>
@@ -20837,7 +20848,6 @@
                 <w:sz w:val="17"/>
                 <w:szCs w:val="17"/>
               </w:rPr>
-              <w:lastRenderedPageBreak/>
               <w:t>EstAltitud</w:t>
             </w:r>
             <w:proofErr w:type="spellEnd"/>
@@ -32193,15 +32203,7 @@
         <w:jc w:val="both"/>
       </w:pPr>
       <w:r>
-        <w:t xml:space="preserve">Configuración de </w:t>
-      </w:r>
-      <w:proofErr w:type="spellStart"/>
-      <w:r>
-        <w:t>SecurityFilterChain</w:t>
-      </w:r>
-      <w:proofErr w:type="spellEnd"/>
-      <w:r>
-        <w:t xml:space="preserve"> con reglas de acceso por rol (ADMIN_MTC, TRAVEL_GROUP_USER, TURISTA_PUBLICO).</w:t>
+        <w:t>Configuración de SecurityFilterChain con reglas de acceso por rol (ADMIN_MTC, TRAVEL_GROUP_USER, PERURAIL_ADMIN, TURISTA_PUBLICO).</w:t>
       </w:r>
     </w:p>
     <w:p>
@@ -32251,7 +32253,7 @@
         <w:jc w:val="both"/>
       </w:pPr>
       <w:r>
-        <w:t>Retrospectiva: Se verificó que los tres roles funcionan correctamente con sus restricciones; se identificó la necesidad de una prueba de caja negra específica para el acceso denegado, incorporada posteriormente al plan de pruebas.</w:t>
+        <w:t>Retrospectiva: Se verificó que los cuatro roles funcionan correctamente con sus restricciones; se identificó la necesidad de una prueba de caja negra específica para el acceso denegado, incorporada posteriormente al plan de pruebas.</w:t>
       </w:r>
     </w:p>
     <w:p>
@@ -41674,6 +41676,7 @@
   <w:style w:type="character" w:default="1" w:styleId="Fuentedeprrafopredeter">
     <w:name w:val="Default Paragraph Font"/>
     <w:uiPriority w:val="1"/>
+    <w:semiHidden/>
     <w:unhideWhenUsed/>
   </w:style>
   <w:style w:type="table" w:default="1" w:styleId="Tablanormal">

</xml_diff>